<commit_message>
refactor: clarify the boundary between statutory access rights and federal discovery in the front-door rule documentation
</commit_message>
<xml_diff>
--- a/output/docx/实体审理之前：高影响人工智能诉讼的部署责任入口-含关键词.docx
+++ b/output/docx/实体审理之前：高影响人工智能诉讼的部署责任入口-含关键词.docx
@@ -548,7 +548,7 @@
             <w:rFonts w:hint="eastAsia" w:ascii="Noto Serif CJK SC" w:hAnsi="Noto Serif CJK SC" w:eastAsia="Noto Serif CJK SC" w:cs="Noto Serif CJK SC"/>
             <w:lang w:val="en-US" w:eastAsia="zh-CN"/>
           </w:rPr>
-          <w:t xml:space="preserve">（七）首次答复为何属于实体法上的信息获取权，而非提前启动的证据开示</w:t>
+          <w:t xml:space="preserve">（七）部署责任入口止于联邦证据开示开始之处</w:t>
         </w:r>
       </w:hyperlink>
       <w:r>
@@ -1448,7 +1448,7 @@
           <w:rFonts w:hint="eastAsia" w:ascii="Noto Serif CJK SC" w:hAnsi="Noto Serif CJK SC" w:eastAsia="Noto Serif CJK SC" w:cs="Noto Serif CJK SC"/>
           <w:lang w:val="en-US" w:eastAsia="zh-CN"/>
         </w:rPr>
-        <w:t xml:space="preserve">本文分五个部分展开这一核心贡献。第一部分识别实体审理前归责缺口，将本文方案与相邻的证据获取研究区分开来，并将部署控制级联压缩为明确缺失记录的工具。第二部分阐明部署责任入口规则，分离第一阶段与第二阶段，界定实质性控制，提供示范性法条，并协调这项实体法上的信息获取权与联邦程序。第三部分将规则适用于两种互为补充的情形：在</w:t>
+        <w:t xml:space="preserve">本文分五个部分展开这一核心贡献。第一部分识别实体审理前归责缺口，将本文方案与相邻的证据获取研究区分开来，并将部署控制级联压缩为明确缺失记录的工具。第二部分阐明部署责任入口规则，分离第一阶段与第二阶段，界定实质性控制，提供示范性法条，并划定法定首次答复与联邦证据开示之间的边界。第三部分将规则适用于两种互为补充的情形：在</w:t>
       </w:r>
       <w:r>
         <w:rPr>
@@ -3798,7 +3798,7 @@
           <w:rFonts w:hint="eastAsia" w:ascii="Noto Serif CJK SC" w:hAnsi="Noto Serif CJK SC" w:eastAsia="Noto Serif CJK SC" w:cs="Noto Serif CJK SC"/>
           <w:lang w:val="en-US" w:eastAsia="zh-CN"/>
         </w:rPr>
-        <w:t xml:space="preserve">规定一项累积适用且针对特定风险的检验。第（四）节分别处理记录生成、保全与分阶段提供。第（五）节规定保密、救济与安全退出。第（六）节以示范法条文本整合本方案，第（七）节则说明，州法规定的事前记录义务如何与《联邦民事诉讼规则》并行运作。</w:t>
+        <w:t xml:space="preserve">规定一项累积适用且针对特定风险的检验。第（四）节分别处理记录生成、保全与分阶段提供。第（五）节规定保密、救济与安全退出。第（六）节以示范法条文本整合本方案；第（七）节则说明，为何事前记录义务仍处于《联邦民事诉讼规则》的射程之外，以及凡联邦诉讼当事人之间的证据开示已经回答同一问题时，法定信息获取路径即告终止。</w:t>
       </w:r>
     </w:p>
     <w:bookmarkStart w:id="136" w:name="sectoral-designation-defines-the-field"/>
@@ -3995,7 +3995,7 @@
           <w:rFonts w:hint="eastAsia" w:ascii="Noto Serif CJK SC" w:hAnsi="Noto Serif CJK SC" w:eastAsia="Noto Serif CJK SC" w:cs="Noto Serif CJK SC"/>
           <w:lang w:val="en-US" w:eastAsia="zh-CN"/>
         </w:rPr>
-        <w:t xml:space="preserve">该通知所启动的是一项存在于实体问题证据开示之外的法定信息获取权。通知可以在起诉前、起诉时或起诉后送达。交付应通过指定文件所列的电子渠道或注册代理人渠道进行；交付会触发运营者的首次答复义务，但不构成后续诉讼的诉讼文书送达。运营者应在三十日内作出答复、逐字段提出异议，或说明没有受规制部署处理所指明的事件；如能说明存在技术、隐私或安全需要，可以获得一次短期延期。保持沉默、笼统声称信息专有，或者将请求人转介给未具名的供应商，均不构成答复。</w:t>
+        <w:t xml:space="preserve">该通知所启动的是一项存在于实体问题证据开示之外的法定信息获取权。该通知可以在提交诉状前交付。在州级程序或其他合法裁判机构中，指定文件也可以允许通知随诉状一并交付，或在诉状提交后交付；对于涉及该不利事件的联邦诉讼系属后向另一当事人请求的字段，第7条另行规定适用边界。交付应通过指定文件所列的电子渠道或注册代理人渠道进行；交付会触发运营者的首次答复义务，但不构成后续诉讼的诉讼文书送达。运营者应在三十日内作出答复、逐字段提出异议，或说明没有受规制部署处理所指明的事件；如能说明存在技术、隐私或安全需要，可以获得一次短期延期。保持沉默、笼统声称信息专有，或者将请求人转介给未具名的供应商，均不构成答复。</w:t>
       </w:r>
     </w:p>
     <w:p>
@@ -5362,21 +5362,21 @@
           <w:bCs/>
           <w:lang w:val="en-US" w:eastAsia="zh-CN"/>
         </w:rPr>
-        <w:t xml:space="preserve">第一阶段通知。</w:t>
-      </w:r>
-      <w:r>
-        <w:rPr>
-          <w:rFonts w:ascii="Noto Serif CJK SC" w:hAnsi="Noto Serif CJK SC" w:eastAsia="Noto Serif CJK SC" w:cs="Noto Serif CJK SC"/>
-          <w:lang w:val="en-US" w:eastAsia="zh-CN"/>
-        </w:rPr>
-        <w:t xml:space="preserve"> </w:t>
-      </w:r>
-      <w:r>
-        <w:rPr>
-          <w:rFonts w:hint="eastAsia" w:ascii="Noto Serif CJK SC" w:hAnsi="Noto Serif CJK SC" w:eastAsia="Noto Serif CJK SC" w:cs="Noto Serif CJK SC"/>
-          <w:lang w:val="en-US" w:eastAsia="zh-CN"/>
-        </w:rPr>
-        <w:t xml:space="preserve">受影响者可以向对外可见的运营者之指定代理人交付宣誓陈述，或根据伪证罪罚则作出的陈述，其中应载明：（a）影响指定文件所列法律保护利益的不利事件；（b）该事件经由何项受规制部署或哪一对外可见的运营者发生；（c）足以将所请求身份字段和事件字段与该事件合理联系起来的事实；（d）在合理可得范围内尽可能具体地说明事件、交易、账户、申请、决定或期间；（e）所请求的限定字段；以及（f）拟善意利用答复来评估、质疑、申诉或就该事件寻求救济。第一阶段不要求提供仅由部署记录掌握的事实。有律师代理的，律师应证明目的正当并已作合理调查。交付会触发首次答复义务，但不构成执行诉讼的诉讼文书送达。</w:t>
+        <w:t xml:space="preserve">第一阶段通知；不构成前置条件。</w:t>
+      </w:r>
+      <w:r>
+        <w:rPr>
+          <w:rFonts w:ascii="Noto Serif CJK SC" w:hAnsi="Noto Serif CJK SC" w:eastAsia="Noto Serif CJK SC" w:cs="Noto Serif CJK SC"/>
+          <w:lang w:val="en-US" w:eastAsia="zh-CN"/>
+        </w:rPr>
+        <w:t xml:space="preserve"> </w:t>
+      </w:r>
+      <w:r>
+        <w:rPr>
+          <w:rFonts w:hint="eastAsia" w:ascii="Noto Serif CJK SC" w:hAnsi="Noto Serif CJK SC" w:eastAsia="Noto Serif CJK SC" w:cs="Noto Serif CJK SC"/>
+          <w:lang w:val="en-US" w:eastAsia="zh-CN"/>
+        </w:rPr>
+        <w:t xml:space="preserve">受影响者可以向对外可见的运营者之指定代理人交付宣誓陈述，或根据伪证罪罚则作出的陈述，其中应载明：（a）影响指定文件所列法律保护利益的不利事件；（b）该事件经由何项受规制部署或哪一对外可见的运营者发生；（c）足以将所请求身份字段和事件字段与该事件合理联系起来的事实；（d）在合理可得范围内尽可能具体地说明事件、交易、账户、申请、决定或期间；（e）所请求的限定字段；以及（f）拟善意利用答复来评估、质疑、申诉或就该事件寻求救济。第一阶段不要求提供仅由部署记录掌握的事实。如有律师代理，律师应向运营者证明请求目的正当且已进行合理调查。交付会触发首次答复义务，但不构成执行诉讼的诉讼文书送达。除为执行本法创设之义务而提起的诉讼外，启动或穷尽第一阶段程序，不构成提起或维持任何诉讼的前置条件。未启动第一阶段，或首次答复不完整，不会就任何其他诉讼请求产生诉状陈述要求、驳回理由、中止理由或抗辩。</w:t>
       </w:r>
     </w:p>
     <w:p>
@@ -5546,21 +5546,33 @@
           <w:bCs/>
           <w:lang w:val="en-US" w:eastAsia="zh-CN"/>
         </w:rPr>
-        <w:t xml:space="preserve">第二阶段与保护。</w:t>
-      </w:r>
-      <w:r>
-        <w:rPr>
-          <w:rFonts w:ascii="Noto Serif CJK SC" w:hAnsi="Noto Serif CJK SC" w:eastAsia="Noto Serif CJK SC" w:cs="Noto Serif CJK SC"/>
-          <w:lang w:val="en-US" w:eastAsia="zh-CN"/>
-        </w:rPr>
-        <w:t xml:space="preserve"> </w:t>
-      </w:r>
-      <w:r>
-        <w:rPr>
-          <w:rFonts w:hint="eastAsia" w:ascii="Noto Serif CJK SC" w:hAnsi="Noto Serif CJK SC" w:eastAsia="Noto Serif CJK SC" w:cs="Noto Serif CJK SC"/>
-          <w:lang w:val="en-US" w:eastAsia="zh-CN"/>
-        </w:rPr>
-        <w:t xml:space="preserve">只有在第一阶段材料支持一个与具体诉讼请求相关的控制环节——包括相关功能构成事件路径的一部分或支配某项安全保障——且所请求信息与某项构成要件、抗辩或救济具有非微不足道的关联，并且提供记录具有必要性和合比例性时，方可依协议取得或在正在进行的程序中命令提供其他非特权材料。提供范围应由时间、版本、受影响群体、功能和所主张风险限定。对于源代码、权重、敏感数据、原始内容、表达性审议材料及安全控制，必须书面认定侵扰性更小的证据无法合理解决实质问题后，方可提供。争议性受保护材料的权利人以及任何受到实质影响的第三人，应在披露前收到通知并有机会获得迅速中立审查。裁判机构应通过最小化、涂黑、假名化、限制访问、安全专家审查、不公开审查或其他合法保障，保护特权、隐私、商业秘密、研究、结社、表达与安全。在正在进行的联邦诉讼中，第二阶段的提供与保护适用《联邦民事诉讼规则》。</w:t>
+        <w:t xml:space="preserve">第二阶段、联邦法院边界与保护措施。</w:t>
+      </w:r>
+      <w:r>
+        <w:rPr>
+          <w:rFonts w:ascii="Noto Serif CJK SC" w:hAnsi="Noto Serif CJK SC" w:eastAsia="Noto Serif CJK SC" w:cs="Noto Serif CJK SC"/>
+          <w:lang w:val="en-US" w:eastAsia="zh-CN"/>
+        </w:rPr>
+        <w:t xml:space="preserve"> </w:t>
+      </w:r>
+      <w:r>
+        <w:rPr>
+          <w:rFonts w:hint="eastAsia" w:ascii="Noto Serif CJK SC" w:hAnsi="Noto Serif CJK SC" w:eastAsia="Noto Serif CJK SC" w:cs="Noto Serif CJK SC"/>
+          <w:lang w:val="en-US" w:eastAsia="zh-CN"/>
+        </w:rPr>
+        <w:t xml:space="preserve">只有在第一阶段材料支持一个针对具体诉讼请求的控制环节——包括相关功能构成事件路径的一部分或支配某项安全保障——且所请求信息与某项构成要件、抗辩或救济具有非微不足道的关联，并且提供记录具有必要性和合比例性时，方可依协议取得或在正在进行的程序中命令提供其他非特权材料。提供范围应由时间、版本、受影响群体、功能和所主张风险限定。对于源代码、权重、敏感数据、原始内容、表达性审议材料及安全控制，必须书面认定侵扰性更小的证据无法合理解决实质问题后，方可提供。争议性受保护材料的权利人以及任何受到实质影响的第三人，应在披露前收到通知并有机会获得迅速中立审查。裁判机构应通过最小化、涂黑、假名化、限制访问、安全专家审查、不公开审查或其他合法保障，保护特权、隐私、商业秘密、研究、结社、表达与安全。</w:t>
+      </w:r>
+    </w:p>
+    <w:p>
+      <w:pPr>
+        <w:pStyle w:val="BlockText"/>
+      </w:pPr>
+      <w:r>
+        <w:rPr>
+          <w:rFonts w:hint="eastAsia" w:ascii="Noto Serif CJK SC" w:hAnsi="Noto Serif CJK SC" w:eastAsia="Noto Serif CJK SC" w:cs="Noto Serif CJK SC"/>
+          <w:lang w:val="en-US" w:eastAsia="zh-CN"/>
+        </w:rPr>
+        <w:t xml:space="preserve">在美国联邦法院系属的诉讼中，所有第二阶段材料提供与保护均适用《联邦民事诉讼规则》。涉及该不利事件的诉讼在该法院系属后，除就该诉讼提起前已经完成的首次答复违法寻求救济外，任何当事人均不得援引第一阶段，从该诉讼中的另一方当事人处取得字段。对于诉讼系属后首次向另一当事人请求的字段，首次答复义务应当通过《联邦民事诉讼规则》履行，并以该规则为限。本法不创设超出第26(b)(1)条范围向当事人取得材料的权利，不使证据开示早于第26(d)条所定时间，也不扩大第34条或第45条下的材料提供权或传票权。第2条和第4条规定的记录生成、留存与保全义务，不因诉讼是否系属而受影响。</w:t>
       </w:r>
     </w:p>
     <w:p>
@@ -5698,7 +5710,43 @@
           <w:rFonts w:hint="eastAsia" w:ascii="Noto Serif CJK SC" w:hAnsi="Noto Serif CJK SC" w:eastAsia="Noto Serif CJK SC" w:cs="Noto Serif CJK SC"/>
           <w:lang w:val="en-US" w:eastAsia="zh-CN"/>
         </w:rPr>
-        <w:t xml:space="preserve">对受影响者而言，生成、保存和提供最低限度记录的义务不得放弃；该义务因受规制部署而产生，无论争议已经诉讼、仲裁或从未提出，均持续存在。有效仲裁协议可以依据《联邦仲裁法》选择私人争议解决机构；首次答复期限仍独立计算，首次答复并非启动或继续仲裁的前置条件。主管机关并非协议当事人的，协议不得限制其以自身名义开展公共执法。本法任何规定均不创设美国宪法第三条意义上的诉讼资格、对人管辖权或事项管辖权；不排除豁免或特权；不使仲裁协议非签署方受其约束；也不改变有关诉状、送达、当事人合并、证据开示、修正、保护令、禁令及制裁的联邦规则。法院和仲裁员负责执行本法创设的义务；其不得从一般证据开示权中推导这些义务。</w:t>
+        <w:t xml:space="preserve">对受影响者而言，生成、保存和提供最低限度记录的义务不得放弃；该义务因受规制部署而产生，无论争议是否提起诉讼、提交仲裁，或从未启动任何程序，均持续存在。除作为执行首次答复义务本身之请求权的一项构成要件外，启动或穷尽第一阶段程序，不构成提起或维持任何民事诉讼或仲裁的前置条件。未启动第一阶段，或首次答复不完整，不会就任何其他诉讼请求产生诉状陈述要求、驳回理由、中止理由或抗辩。</w:t>
+      </w:r>
+    </w:p>
+    <w:p>
+      <w:pPr>
+        <w:pStyle w:val="BlockText"/>
+      </w:pPr>
+      <w:r>
+        <w:rPr>
+          <w:rFonts w:hint="eastAsia" w:ascii="Noto Serif CJK SC" w:hAnsi="Noto Serif CJK SC" w:eastAsia="Noto Serif CJK SC" w:cs="Noto Serif CJK SC"/>
+          <w:lang w:val="en-US" w:eastAsia="zh-CN"/>
+        </w:rPr>
+        <w:t xml:space="preserve">有效仲裁协议可以依据《联邦仲裁法》选择私人争议解决机构；首次答复期限仍独立计算，除作为执行首次答复义务本身之请求权的一项构成要件外，完成第一阶段并非启动或继续仲裁的前置条件。主管机关并非协议当事人的，协议不得限制其以自身名义开展公共执法。</w:t>
+      </w:r>
+    </w:p>
+    <w:p>
+      <w:pPr>
+        <w:pStyle w:val="BlockText"/>
+      </w:pPr>
+      <w:r>
+        <w:rPr>
+          <w:rFonts w:hint="eastAsia" w:ascii="Noto Serif CJK SC" w:hAnsi="Noto Serif CJK SC" w:eastAsia="Noto Serif CJK SC" w:cs="Noto Serif CJK SC"/>
+          <w:lang w:val="en-US" w:eastAsia="zh-CN"/>
+        </w:rPr>
+        <w:t xml:space="preserve">对联邦诉讼提起前已经完成的首次答复违法提出执行请求，所寻求的是第9条规定的履行救济。在联邦法院，《联邦民事诉讼规则》规制诉讼的提起、诉状陈述、送达、临时救济、裁判与判决。涉及不利事件的联邦诉讼系属后首次向另一当事人请求的任何字段，适用第7条。</w:t>
+      </w:r>
+    </w:p>
+    <w:p>
+      <w:pPr>
+        <w:pStyle w:val="BlockText"/>
+      </w:pPr>
+      <w:r>
+        <w:rPr>
+          <w:rFonts w:hint="eastAsia" w:ascii="Noto Serif CJK SC" w:hAnsi="Noto Serif CJK SC" w:eastAsia="Noto Serif CJK SC" w:cs="Noto Serif CJK SC"/>
+          <w:lang w:val="en-US" w:eastAsia="zh-CN"/>
+        </w:rPr>
+        <w:t xml:space="preserve">本法任何规定均不创设美国宪法第三条意义上的诉讼资格、对人管辖权或事项管辖权；不排除豁免或特权；不使仲裁协议非签署方受其约束；也不改变有关诉状、送达、当事人合并、证据开示、修正、保护令、禁令及制裁的联邦规则。法院和仲裁员负责实施本法创设的义务；这些义务并非源自其通常证据开示权限。</w:t>
       </w:r>
     </w:p>
     <w:p>
@@ -5770,7 +5818,7 @@
           <w:rFonts w:hint="eastAsia" w:ascii="Noto Sans CJK SC" w:hAnsi="Noto Sans CJK SC" w:eastAsia="Noto Sans CJK SC" w:cs="Noto Sans CJK SC"/>
           <w:lang w:val="en-US" w:eastAsia="zh-CN"/>
         </w:rPr>
-        <w:t xml:space="preserve">（七）首次答复为何属于实体法上的信息获取权，而非提前启动的证据开示</w:t>
+        <w:t xml:space="preserve">（七）部署责任入口止于联邦证据开示开始之处</w:t>
       </w:r>
     </w:p>
     <w:p>
@@ -5782,94 +5830,7 @@
           <w:rFonts w:hint="eastAsia" w:ascii="Noto Serif CJK SC" w:hAnsi="Noto Serif CJK SC" w:eastAsia="Noto Serif CJK SC" w:cs="Noto Serif CJK SC"/>
           <w:lang w:val="en-US" w:eastAsia="zh-CN"/>
         </w:rPr>
-        <w:t xml:space="preserve">州部署责任入口法所规制的是受规制部署的运营，而不是改写联邦诉讼程序。运营者使指定部署可供使用或将其纳入受影响流程时，最低限度记录义务即告产生。无论诉讼尚在预期、已经进行、提交仲裁或从未提出，只要收到合格请求，首次答复义务即告产生。其内容由指定文件固定——身份、事件、来源、保管和控制字段——而不是取决于某一具体诉状的相关性范围。拒绝答复本身即构成独立法定违法。只有第二阶段才开始针对具体诉讼请求的证据开示。</w:t>
-      </w:r>
-    </w:p>
-    <w:p>
-      <w:pPr>
-        <w:pStyle w:val="BodyText"/>
-      </w:pPr>
-      <w:r>
-        <w:rPr>
-          <w:rFonts w:hint="eastAsia" w:ascii="Noto Serif CJK SC" w:hAnsi="Noto Serif CJK SC" w:eastAsia="Noto Serif CJK SC" w:cs="Noto Serif CJK SC"/>
-          <w:lang w:val="en-US" w:eastAsia="zh-CN"/>
-        </w:rPr>
-        <w:t xml:space="preserve">这一设计十分重要，因为州法不能仅仅给诉状或证据开示要求换一个名称，便规避《联邦民事诉讼规则》。州法规定的诉前证明要求如果与《联邦民事诉讼规则》关于联邦诉状须载内容的规定相冲突，联邦法院会拒绝适用。</w:t>
-      </w:r>
-      <w:r>
-        <w:rPr>
-          <w:rFonts w:ascii="Noto Serif CJK SC" w:hAnsi="Noto Serif CJK SC" w:eastAsia="Noto Serif CJK SC" w:cs="Noto Serif CJK SC"/>
-          <w:rStyle w:val="FootnoteReference"/>
-          <w:lang w:val="en-US" w:eastAsia="zh-CN"/>
-        </w:rPr>
-        <w:footnoteReference w:id="149"/>
-      </w:r>
-      <w:r>
-        <w:rPr>
-          <w:rFonts w:ascii="Noto Serif CJK SC" w:hAnsi="Noto Serif CJK SC" w:eastAsia="Noto Serif CJK SC" w:cs="Noto Serif CJK SC"/>
-          <w:lang w:val="en-US" w:eastAsia="zh-CN"/>
-        </w:rPr>
-        <w:t xml:space="preserve"> </w:t>
-      </w:r>
-      <w:r>
-        <w:rPr>
-          <w:rFonts w:hint="eastAsia" w:ascii="Noto Serif CJK SC" w:hAnsi="Noto Serif CJK SC" w:eastAsia="Noto Serif CJK SC" w:cs="Noto Serif CJK SC"/>
-          <w:lang w:val="en-US" w:eastAsia="zh-CN"/>
-        </w:rPr>
-        <w:t xml:space="preserve">部署责任入口所提出的是另一问题。它要求在运营期间生成记录，并在起诉前赋予受影响者一项与特定交易相联系的信息获取权。执行该权利的联邦诉状仍适用《联邦民事诉讼规则》第8条；其他记录提供则仍适用该规则第26、34及45条。</w:t>
-      </w:r>
-    </w:p>
-    <w:p>
-      <w:pPr>
-        <w:pStyle w:val="BodyText"/>
-      </w:pPr>
-      <w:r>
-        <w:rPr>
-          <w:rFonts w:hint="eastAsia" w:ascii="Noto Serif CJK SC" w:hAnsi="Noto Serif CJK SC" w:eastAsia="Noto Serif CJK SC" w:cs="Noto Serif CJK SC"/>
-          <w:lang w:val="en-US" w:eastAsia="zh-CN"/>
-        </w:rPr>
-        <w:t xml:space="preserve">因此，权利与其执行机构必须分开。州法不能凭空创设联邦事项管辖权。受影响者通常应在指定的州级裁判机构起诉；如符合多元国籍管辖要求，可以援引该管辖；如国会创设联邦权利，可以主张该权利；如州法信息获取请求构成已属联邦管辖案件的一部分，则可寻求补充管辖。</w:t>
-      </w:r>
-      <w:r>
-        <w:rPr>
-          <w:rFonts w:ascii="Noto Serif CJK SC" w:hAnsi="Noto Serif CJK SC" w:eastAsia="Noto Serif CJK SC" w:cs="Noto Serif CJK SC"/>
-          <w:rStyle w:val="FootnoteReference"/>
-          <w:lang w:val="en-US" w:eastAsia="zh-CN"/>
-        </w:rPr>
-        <w:footnoteReference w:id="150"/>
-      </w:r>
-      <w:r>
-        <w:rPr>
-          <w:rFonts w:ascii="Noto Serif CJK SC" w:hAnsi="Noto Serif CJK SC" w:eastAsia="Noto Serif CJK SC" w:cs="Noto Serif CJK SC"/>
-          <w:lang w:val="en-US" w:eastAsia="zh-CN"/>
-        </w:rPr>
-        <w:t xml:space="preserve"> </w:t>
-      </w:r>
-      <w:r>
-        <w:rPr>
-          <w:rFonts w:hint="eastAsia" w:ascii="Noto Serif CJK SC" w:hAnsi="Noto Serif CJK SC" w:eastAsia="Noto Serif CJK SC" w:cs="Noto Serif CJK SC"/>
-          <w:lang w:val="en-US" w:eastAsia="zh-CN"/>
-        </w:rPr>
-        <w:t xml:space="preserve">争议一旦进入联邦法院，诉状、送达、证据开示、修正、保护及制裁均适用联邦规则。</w:t>
-      </w:r>
-    </w:p>
-    <w:p>
-      <w:pPr>
-        <w:pStyle w:val="BodyText"/>
-      </w:pPr>
-      <w:r>
-        <w:rPr>
-          <w:rFonts w:hint="eastAsia" w:ascii="Noto Serif CJK SC" w:hAnsi="Noto Serif CJK SC" w:eastAsia="Noto Serif CJK SC" w:cs="Noto Serif CJK SC"/>
-          <w:lang w:val="en-US" w:eastAsia="zh-CN"/>
-        </w:rPr>
-        <w:t xml:space="preserve">美国宪法第三条对联邦信息获取诉讼另有一重限制。立法机关授予请求权固然会影响审查，却不会使每一项法定违法都自动成为具体损害。在</w:t>
-      </w:r>
-      <w:r>
-        <w:rPr>
-          <w:rFonts w:ascii="Noto Serif CJK SC" w:hAnsi="Noto Serif CJK SC" w:eastAsia="Noto Serif CJK SC" w:cs="Noto Serif CJK SC"/>
-          <w:lang w:val="en-US" w:eastAsia="zh-CN"/>
-        </w:rPr>
-        <w:t xml:space="preserve"> </w:t>
+        <w:t xml:space="preserve">部署责任入口最持久的贡献，发生在任何信息获取争议之前。没有任何一项联邦规则规定，企业在运营受规制部署期间必须生成何种版本、批准、评估、逐级上报、干预、事件或调取记录。《联邦民事诉讼规则》第34条允许请求提供当事人占有、保管或控制范围内已存在的特定材料；它并不要求企业首先生成该记录。因此，即便联邦法院在诉讼开始后不予执行针对另一当事人的首次答复请求，事前义务仍已完成本文不可或缺的工作。部署仍然可以识别，事件记录与控制记录已经存在，通常的联邦证据开示程序可以在其自身规则限制下取得这些记录。因此，</w:t>
       </w:r>
       <w:r>
         <w:rPr>
@@ -5878,22 +5839,27 @@
           <w:iCs/>
           <w:lang w:val="en-US" w:eastAsia="zh-CN"/>
         </w:rPr>
-        <w:t xml:space="preserve">TransUnion</w:t>
-      </w:r>
-      <w:r>
-        <w:rPr>
-          <w:rFonts w:ascii="Noto Serif CJK SC" w:hAnsi="Noto Serif CJK SC" w:eastAsia="Noto Serif CJK SC" w:cs="Noto Serif CJK SC"/>
-          <w:lang w:val="en-US" w:eastAsia="zh-CN"/>
-        </w:rPr>
-        <w:t xml:space="preserve"> </w:t>
-      </w:r>
-      <w:r>
-        <w:rPr>
-          <w:rFonts w:hint="eastAsia" w:ascii="Noto Serif CJK SC" w:hAnsi="Noto Serif CJK SC" w:eastAsia="Noto Serif CJK SC" w:cs="Noto Serif CJK SC"/>
-          <w:lang w:val="en-US" w:eastAsia="zh-CN"/>
-        </w:rPr>
-        <w:t xml:space="preserve">一案中，最高法院审理的原告未主张后续不利影响，因而无法证明具体的信息损害；</w:t>
-      </w:r>
+        <w:t xml:space="preserve">Erie</w:t>
+      </w:r>
+      <w:r>
+        <w:rPr>
+          <w:rFonts w:ascii="Noto Serif CJK SC" w:hAnsi="Noto Serif CJK SC" w:eastAsia="Noto Serif CJK SC" w:cs="Noto Serif CJK SC"/>
+          <w:lang w:val="en-US" w:eastAsia="zh-CN"/>
+        </w:rPr>
+        <w:t xml:space="preserve"> </w:t>
+      </w:r>
+      <w:r>
+        <w:rPr>
+          <w:rFonts w:hint="eastAsia" w:ascii="Noto Serif CJK SC" w:hAnsi="Noto Serif CJK SC" w:eastAsia="Noto Serif CJK SC" w:cs="Noto Serif CJK SC"/>
+          <w:lang w:val="en-US" w:eastAsia="zh-CN"/>
+        </w:rPr>
+        <w:t xml:space="preserve">仅在范围有限的一类联邦案件中支配信息获取路径；它并不决定受规制部署是否必须保持可观察性。</w:t>
+      </w:r>
+    </w:p>
+    <w:p>
+      <w:pPr>
+        <w:pStyle w:val="BodyText"/>
+      </w:pPr>
       <w:r>
         <w:rPr>
           <w:rFonts w:ascii="Noto Serif CJK SC" w:hAnsi="Noto Serif CJK SC" w:eastAsia="Noto Serif CJK SC" w:cs="Noto Serif CJK SC"/>
@@ -5901,99 +5867,35 @@
           <w:iCs/>
           <w:lang w:val="en-US" w:eastAsia="zh-CN"/>
         </w:rPr>
-        <w:t xml:space="preserve">Spokeo</w:t>
-      </w:r>
-      <w:r>
-        <w:rPr>
-          <w:rFonts w:ascii="Noto Serif CJK SC" w:hAnsi="Noto Serif CJK SC" w:eastAsia="Noto Serif CJK SC" w:cs="Noto Serif CJK SC"/>
-          <w:lang w:val="en-US" w:eastAsia="zh-CN"/>
-        </w:rPr>
-        <w:t xml:space="preserve"> </w:t>
-      </w:r>
-      <w:r>
-        <w:rPr>
-          <w:rFonts w:hint="eastAsia" w:ascii="Noto Serif CJK SC" w:hAnsi="Noto Serif CJK SC" w:eastAsia="Noto Serif CJK SC" w:cs="Noto Serif CJK SC"/>
-          <w:lang w:val="en-US" w:eastAsia="zh-CN"/>
-        </w:rPr>
-        <w:t xml:space="preserve">同样区分法律违法与具体的事实损害。</w:t>
-      </w:r>
-      <w:r>
-        <w:rPr>
-          <w:rFonts w:ascii="Noto Serif CJK SC" w:hAnsi="Noto Serif CJK SC" w:eastAsia="Noto Serif CJK SC" w:cs="Noto Serif CJK SC"/>
-          <w:rStyle w:val="FootnoteReference"/>
-          <w:lang w:val="en-US" w:eastAsia="zh-CN"/>
-        </w:rPr>
-        <w:footnoteReference w:id="151"/>
-      </w:r>
-      <w:r>
-        <w:rPr>
-          <w:rFonts w:ascii="Noto Serif CJK SC" w:hAnsi="Noto Serif CJK SC" w:eastAsia="Noto Serif CJK SC" w:cs="Noto Serif CJK SC"/>
-          <w:lang w:val="en-US" w:eastAsia="zh-CN"/>
-        </w:rPr>
-        <w:t xml:space="preserve"> </w:t>
-      </w:r>
-      <w:r>
-        <w:rPr>
-          <w:rFonts w:hint="eastAsia" w:ascii="Noto Serif CJK SC" w:hAnsi="Noto Serif CJK SC" w:eastAsia="Noto Serif CJK SC" w:cs="Noto Serif CJK SC"/>
-          <w:lang w:val="en-US" w:eastAsia="zh-CN"/>
-        </w:rPr>
-        <w:t xml:space="preserve">有关信息型诉讼资格的判例认为，如果原告本人被拒绝取得法律要求披露的信息，且该信息与受保护用途直接相关，即具备具体性。</w:t>
-      </w:r>
-      <w:r>
-        <w:rPr>
-          <w:rFonts w:ascii="Noto Serif CJK SC" w:hAnsi="Noto Serif CJK SC" w:eastAsia="Noto Serif CJK SC" w:cs="Noto Serif CJK SC"/>
-          <w:rStyle w:val="FootnoteReference"/>
-          <w:lang w:val="en-US" w:eastAsia="zh-CN"/>
-        </w:rPr>
-        <w:footnoteReference w:id="152"/>
-      </w:r>
-      <w:r>
-        <w:rPr>
-          <w:rFonts w:ascii="Noto Serif CJK SC" w:hAnsi="Noto Serif CJK SC" w:eastAsia="Noto Serif CJK SC" w:cs="Noto Serif CJK SC"/>
-          <w:lang w:val="en-US" w:eastAsia="zh-CN"/>
-        </w:rPr>
-        <w:t xml:space="preserve"> </w:t>
-      </w:r>
-      <w:r>
-        <w:rPr>
-          <w:rFonts w:hint="eastAsia" w:ascii="Noto Serif CJK SC" w:hAnsi="Noto Serif CJK SC" w:eastAsia="Noto Serif CJK SC" w:cs="Noto Serif CJK SC"/>
-          <w:lang w:val="en-US" w:eastAsia="zh-CN"/>
-        </w:rPr>
-        <w:t xml:space="preserve">因此，在联邦部署责任入口诉讼中，原告应主张，拒绝提供信息妨碍其识别、质疑、申诉或就特定不利事件寻求救济的能力，或者造成合理实际支出等其他具体影响。即使立法机关创设了请求权，单纯迟延如与上述用途无关，仍可能无法在联邦法院成立。州法院继续适用本州宪法和诉讼资格规则；仅因平行的联邦诉讼不具备诉讼资格，美国宪法第三条并不要求州级裁判机构也相应拒绝受理。</w:t>
-      </w:r>
-      <w:r>
-        <w:rPr>
-          <w:rFonts w:ascii="Noto Serif CJK SC" w:hAnsi="Noto Serif CJK SC" w:eastAsia="Noto Serif CJK SC" w:cs="Noto Serif CJK SC"/>
-          <w:rStyle w:val="FootnoteReference"/>
-          <w:lang w:val="en-US" w:eastAsia="zh-CN"/>
-        </w:rPr>
-        <w:footnoteReference w:id="153"/>
-      </w:r>
-    </w:p>
-    <w:p>
-      <w:pPr>
-        <w:pStyle w:val="BodyText"/>
-      </w:pPr>
-      <w:r>
-        <w:rPr>
-          <w:rFonts w:hint="eastAsia" w:ascii="Noto Serif CJK SC" w:hAnsi="Noto Serif CJK SC" w:eastAsia="Noto Serif CJK SC" w:cs="Noto Serif CJK SC"/>
-          <w:lang w:val="en-US" w:eastAsia="zh-CN"/>
-        </w:rPr>
-        <w:t xml:space="preserve">随后，《规则授权法》的框架要求将是否存在直接冲突作为</w:t>
-      </w:r>
-      <w:r>
-        <w:rPr>
-          <w:rFonts w:ascii="Noto Serif CJK SC" w:hAnsi="Noto Serif CJK SC" w:eastAsia="Noto Serif CJK SC" w:cs="Noto Serif CJK SC"/>
-          <w:lang w:val="en-US" w:eastAsia="zh-CN"/>
-        </w:rPr>
-        <w:t xml:space="preserve"> Erie </w:t>
-      </w:r>
-      <w:r>
-        <w:rPr>
-          <w:rFonts w:hint="eastAsia" w:ascii="Noto Serif CJK SC" w:hAnsi="Noto Serif CJK SC" w:eastAsia="Noto Serif CJK SC" w:cs="Noto Serif CJK SC"/>
-          <w:lang w:val="en-US" w:eastAsia="zh-CN"/>
-        </w:rPr>
-        <w:t xml:space="preserve">问题的第一步。</w:t>
+        <w:t xml:space="preserve">Berk v. Choy</w:t>
+      </w:r>
+      <w:r>
+        <w:rPr>
+          <w:rFonts w:ascii="Noto Serif CJK SC" w:hAnsi="Noto Serif CJK SC" w:eastAsia="Noto Serif CJK SC" w:cs="Noto Serif CJK SC"/>
+          <w:lang w:val="en-US" w:eastAsia="zh-CN"/>
+        </w:rPr>
+        <w:t xml:space="preserve"> </w:t>
+      </w:r>
+      <w:r>
+        <w:rPr>
+          <w:rFonts w:hint="eastAsia" w:ascii="Noto Serif CJK SC" w:hAnsi="Noto Serif CJK SC" w:eastAsia="Noto Serif CJK SC" w:cs="Noto Serif CJK SC"/>
+          <w:lang w:val="en-US" w:eastAsia="zh-CN"/>
+        </w:rPr>
+        <w:t xml:space="preserve">明确指出，正确的分析轴线在于适用范围，而非法律定性。最高法院撤销了对一宗多元国籍管辖医疗过失诉讼的驳回；该诉讼未附具特拉华州法要求的实体依据宣誓书。由八位大法官组成的多数意见认为，《联邦民事诉讼规则》第8条已经回答，能否因原告未在诉讼开始时提交实体问题证据而驳回诉讼；Jackson</w:t>
+      </w:r>
+      <w:r>
+        <w:rPr>
+          <w:rFonts w:ascii="Noto Serif CJK SC" w:hAnsi="Noto Serif CJK SC" w:eastAsia="Noto Serif CJK SC" w:cs="Noto Serif CJK SC"/>
+          <w:lang w:val="en-US" w:eastAsia="zh-CN"/>
+        </w:rPr>
+        <w:t xml:space="preserve"> </w:t>
+      </w:r>
+      <w:r>
+        <w:rPr>
+          <w:rFonts w:hint="eastAsia" w:ascii="Noto Serif CJK SC" w:hAnsi="Noto Serif CJK SC" w:eastAsia="Noto Serif CJK SC" w:cs="Noto Serif CJK SC"/>
+          <w:lang w:val="en-US" w:eastAsia="zh-CN"/>
+        </w:rPr>
+        <w:t xml:space="preserve">大法官仅同意判决结果，并认为冲突存在于第3条和第12条，而非第8条。各意见虽对具体适用哪项联邦规则意见不一，却都把如何界定“争议中的问题”视为决定性因素。</w:t>
       </w:r>
       <w:r>
         <w:rPr>
@@ -6002,21 +5904,28 @@
           <w:iCs/>
           <w:lang w:val="en-US" w:eastAsia="zh-CN"/>
         </w:rPr>
-        <w:t xml:space="preserve">Hanna</w:t>
-      </w:r>
-      <w:r>
-        <w:rPr>
-          <w:rFonts w:ascii="Noto Serif CJK SC" w:hAnsi="Noto Serif CJK SC" w:eastAsia="Noto Serif CJK SC" w:cs="Noto Serif CJK SC"/>
-          <w:lang w:val="en-US" w:eastAsia="zh-CN"/>
-        </w:rPr>
-        <w:t xml:space="preserve"> </w:t>
-      </w:r>
-      <w:r>
-        <w:rPr>
-          <w:rFonts w:hint="eastAsia" w:ascii="Noto Serif CJK SC" w:hAnsi="Noto Serif CJK SC" w:eastAsia="Noto Serif CJK SC" w:cs="Noto Serif CJK SC"/>
-          <w:lang w:val="en-US" w:eastAsia="zh-CN"/>
-        </w:rPr>
-        <w:t xml:space="preserve">规定，有效联邦规则已经回答法院面前的问题时，应适用该联邦规则。</w:t>
+        <w:t xml:space="preserve">Berk</w:t>
+      </w:r>
+      <w:r>
+        <w:rPr>
+          <w:rFonts w:ascii="Noto Serif CJK SC" w:hAnsi="Noto Serif CJK SC" w:eastAsia="Noto Serif CJK SC" w:cs="Noto Serif CJK SC"/>
+          <w:lang w:val="en-US" w:eastAsia="zh-CN"/>
+        </w:rPr>
+        <w:t xml:space="preserve"> </w:t>
+      </w:r>
+      <w:r>
+        <w:rPr>
+          <w:rFonts w:hint="eastAsia" w:ascii="Noto Serif CJK SC" w:hAnsi="Noto Serif CJK SC" w:eastAsia="Noto Serif CJK SC" w:cs="Noto Serif CJK SC"/>
+          <w:lang w:val="en-US" w:eastAsia="zh-CN"/>
+        </w:rPr>
+        <w:t xml:space="preserve">判决指出，一旦一项有效的联邦规则已经回答该问题，与之冲突的州法即须让位，即便该州法在</w:t>
+      </w:r>
+      <w:r>
+        <w:rPr>
+          <w:rFonts w:ascii="Noto Serif CJK SC" w:hAnsi="Noto Serif CJK SC" w:eastAsia="Noto Serif CJK SC" w:cs="Noto Serif CJK SC"/>
+          <w:lang w:val="en-US" w:eastAsia="zh-CN"/>
+        </w:rPr>
+        <w:t xml:space="preserve"> </w:t>
       </w:r>
       <w:r>
         <w:rPr>
@@ -6025,21 +5934,28 @@
           <w:iCs/>
           <w:lang w:val="en-US" w:eastAsia="zh-CN"/>
         </w:rPr>
-        <w:t xml:space="preserve">Burlington Northern</w:t>
-      </w:r>
-      <w:r>
-        <w:rPr>
-          <w:rFonts w:ascii="Noto Serif CJK SC" w:hAnsi="Noto Serif CJK SC" w:eastAsia="Noto Serif CJK SC" w:cs="Noto Serif CJK SC"/>
-          <w:lang w:val="en-US" w:eastAsia="zh-CN"/>
-        </w:rPr>
-        <w:t xml:space="preserve"> </w:t>
-      </w:r>
-      <w:r>
-        <w:rPr>
-          <w:rFonts w:hint="eastAsia" w:ascii="Noto Serif CJK SC" w:hAnsi="Noto Serif CJK SC" w:eastAsia="Noto Serif CJK SC" w:cs="Noto Serif CJK SC"/>
-          <w:lang w:val="en-US" w:eastAsia="zh-CN"/>
-        </w:rPr>
-        <w:t xml:space="preserve">否定了一项州上诉罚则，因为联邦规则已就相关后果占据同一领域。相反，</w:t>
+        <w:t xml:space="preserve">Erie</w:t>
+      </w:r>
+      <w:r>
+        <w:rPr>
+          <w:rFonts w:ascii="Noto Serif CJK SC" w:hAnsi="Noto Serif CJK SC" w:eastAsia="Noto Serif CJK SC" w:cs="Noto Serif CJK SC"/>
+          <w:lang w:val="en-US" w:eastAsia="zh-CN"/>
+        </w:rPr>
+        <w:t xml:space="preserve"> </w:t>
+      </w:r>
+      <w:r>
+        <w:rPr>
+          <w:rFonts w:hint="eastAsia" w:ascii="Noto Serif CJK SC" w:hAnsi="Noto Serif CJK SC" w:eastAsia="Noto Serif CJK SC" w:cs="Noto Serif CJK SC"/>
+          <w:lang w:val="en-US" w:eastAsia="zh-CN"/>
+        </w:rPr>
+        <w:t xml:space="preserve">框架下可被视为实体法。在《规则授权法》分析阶段，审查的是联邦规则是否“真正规制程序”；被排除州法的实体性质或目的“没有任何影响”。因此，部署责任入口不能建立在第一阶段属于实体法这一命题上，也不能依赖</w:t>
+      </w:r>
+      <w:r>
+        <w:rPr>
+          <w:rFonts w:ascii="Noto Serif CJK SC" w:hAnsi="Noto Serif CJK SC" w:eastAsia="Noto Serif CJK SC" w:cs="Noto Serif CJK SC"/>
+          <w:lang w:val="en-US" w:eastAsia="zh-CN"/>
+        </w:rPr>
+        <w:t xml:space="preserve"> </w:t>
       </w:r>
       <w:r>
         <w:rPr>
@@ -6048,21 +5964,21 @@
           <w:iCs/>
           <w:lang w:val="en-US" w:eastAsia="zh-CN"/>
         </w:rPr>
-        <w:t xml:space="preserve">Walker</w:t>
-      </w:r>
-      <w:r>
-        <w:rPr>
-          <w:rFonts w:ascii="Noto Serif CJK SC" w:hAnsi="Noto Serif CJK SC" w:eastAsia="Noto Serif CJK SC" w:cs="Noto Serif CJK SC"/>
-          <w:lang w:val="en-US" w:eastAsia="zh-CN"/>
-        </w:rPr>
-        <w:t xml:space="preserve"> </w:t>
-      </w:r>
-      <w:r>
-        <w:rPr>
-          <w:rFonts w:hint="eastAsia" w:ascii="Noto Serif CJK SC" w:hAnsi="Noto Serif CJK SC" w:eastAsia="Noto Serif CJK SC" w:cs="Noto Serif CJK SC"/>
-          <w:lang w:val="en-US" w:eastAsia="zh-CN"/>
-        </w:rPr>
-        <w:t xml:space="preserve">适用了与送达相联系的州诉讼时效规则，因为《联邦民事诉讼规则》第3条并未回答州法时效在何时中止。</w:t>
+        <w:t xml:space="preserve">Shady Grove</w:t>
+      </w:r>
+      <w:r>
+        <w:rPr>
+          <w:rFonts w:ascii="Noto Serif CJK SC" w:hAnsi="Noto Serif CJK SC" w:eastAsia="Noto Serif CJK SC" w:cs="Noto Serif CJK SC"/>
+          <w:lang w:val="en-US" w:eastAsia="zh-CN"/>
+        </w:rPr>
+        <w:t xml:space="preserve"> </w:t>
+      </w:r>
+      <w:r>
+        <w:rPr>
+          <w:rFonts w:hint="eastAsia" w:ascii="Noto Serif CJK SC" w:hAnsi="Noto Serif CJK SC" w:eastAsia="Noto Serif CJK SC" w:cs="Noto Serif CJK SC"/>
+          <w:lang w:val="en-US" w:eastAsia="zh-CN"/>
+        </w:rPr>
+        <w:t xml:space="preserve">同意意见中的交织关系表述，将其作为第二步分析中的退路。其成立依据必须是，《联邦民事诉讼规则》并未回答第一阶段所提出的问题。</w:t>
       </w:r>
       <w:r>
         <w:rPr>
@@ -6070,21 +5986,53 @@
           <w:rStyle w:val="FootnoteReference"/>
           <w:lang w:val="en-US" w:eastAsia="zh-CN"/>
         </w:rPr>
-        <w:footnoteReference w:id="154"/>
-      </w:r>
-      <w:r>
-        <w:rPr>
-          <w:rFonts w:ascii="Noto Serif CJK SC" w:hAnsi="Noto Serif CJK SC" w:eastAsia="Noto Serif CJK SC" w:cs="Noto Serif CJK SC"/>
-          <w:lang w:val="en-US" w:eastAsia="zh-CN"/>
-        </w:rPr>
-        <w:t xml:space="preserve"> </w:t>
-      </w:r>
-      <w:r>
-        <w:rPr>
-          <w:rFonts w:hint="eastAsia" w:ascii="Noto Serif CJK SC" w:hAnsi="Noto Serif CJK SC" w:eastAsia="Noto Serif CJK SC" w:cs="Noto Serif CJK SC"/>
-          <w:lang w:val="en-US" w:eastAsia="zh-CN"/>
-        </w:rPr>
-        <w:t xml:space="preserve">固定的部署义务和信息获取义务，只有在其规制运营并创设独立于诉讼而存在的权利时，才属于</w:t>
+        <w:footnoteReference w:id="149"/>
+      </w:r>
+    </w:p>
+    <w:p>
+      <w:pPr>
+        <w:pStyle w:val="BodyText"/>
+      </w:pPr>
+      <w:r>
+        <w:rPr>
+          <w:rFonts w:hint="eastAsia" w:ascii="Noto Serif CJK SC" w:hAnsi="Noto Serif CJK SC" w:eastAsia="Noto Serif CJK SC" w:cs="Noto Serif CJK SC"/>
+          <w:lang w:val="en-US" w:eastAsia="zh-CN"/>
+        </w:rPr>
+        <w:t xml:space="preserve">这一区别具有结构性。特拉华州法要求原告将证据提交法院，作为提起或维持诉讼的一部分。部署责任入口不要求任何诉讼当事人向法院提交材料，不要求诉状增加任何内容，不改变驳回标准，也不为另一项诉讼请求创设前置条件。它所问的是，受规制运营者在运营期间必须记录什么，以及受规制事件发生后应向受影响者交付何种内容固定的身份与事件回执。该义务以部署为基准，而非以诉讼为基准。无论接收人日后提起诉讼、仲裁、行政申诉、寻求内部更正，抑或不启动任何程序，该义务均适用。第3条和第10条使这条界线成为可操作的规则：启动第一阶段不构成前置条件；未启动第一阶段不会就另一诉讼产生诉状陈述瑕疵、驳回理由、中止理由或抗辩。</w:t>
+      </w:r>
+    </w:p>
+    <w:p>
+      <w:pPr>
+        <w:pStyle w:val="BodyText"/>
+      </w:pPr>
+      <w:r>
+        <w:rPr>
+          <w:rFonts w:hint="eastAsia" w:ascii="Noto Serif CJK SC" w:hAnsi="Noto Serif CJK SC" w:eastAsia="Noto Serif CJK SC" w:cs="Noto Serif CJK SC"/>
+          <w:lang w:val="en-US" w:eastAsia="zh-CN"/>
+        </w:rPr>
+        <w:t xml:space="preserve">证据开示规则回答的是时间更晚、性质也不同的一组问题。《联邦民事诉讼规则》第26(b)(1)条界定当事人可就诉讼请求或抗辩取得的相关且合比例的证据开示范围。第26(d)(1)条规定当事人可以寻求该证据开示的时间。第34(a)条授权当事人在第26(b)条范围内，请求另一当事人提供由其占有、保管或控制的特定既有材料。第45条提供由诉讼系属法院签发、用以向特定人员调取资料的传票程序。第37(e)条规定电子存储信息发生受该条规制的灭失时，可以在联邦诉讼中采取的措施。这些规则均以诉讼已经存在、当事人之间已经形成证据开示关系，并且调取对象或记录已经可以识别为前提。没有任何一条规则规定，企业在争议发生前必须生成何种记录，或者必须向一位可能永远不会成为诉讼当事人的人员交付何种与特定交易相联系的回执。</w:t>
+      </w:r>
+      <w:bookmarkStart w:id="236" w:name="_RefFootnote24"/>
+      <w:r>
+        <w:rPr>
+          <w:rFonts w:ascii="Noto Serif CJK SC" w:hAnsi="Noto Serif CJK SC" w:eastAsia="Noto Serif CJK SC" w:cs="Noto Serif CJK SC"/>
+          <w:rStyle w:val="FootnoteReference"/>
+          <w:lang w:val="en-US" w:eastAsia="zh-CN"/>
+        </w:rPr>
+        <w:footnoteReference w:id="150"/>
+      </w:r>
+      <w:bookmarkEnd w:id="236"/>
+    </w:p>
+    <w:p>
+      <w:pPr>
+        <w:pStyle w:val="BodyText"/>
+      </w:pPr>
+      <w:r>
+        <w:rPr>
+          <w:rFonts w:hint="eastAsia" w:ascii="Noto Serif CJK SC" w:hAnsi="Noto Serif CJK SC" w:eastAsia="Noto Serif CJK SC" w:cs="Noto Serif CJK SC"/>
+          <w:lang w:val="en-US" w:eastAsia="zh-CN"/>
+        </w:rPr>
+        <w:t xml:space="preserve">第27条在文本上最为接近，因为它在诉讼提起前即可能适用。然而，该条所回答的是，联邦地区法院能否授权以庭外询问方式保存已经确定的证言，以供拟提起的联邦诉讼使用。在</w:t>
       </w:r>
       <w:r>
         <w:rPr>
@@ -6100,21 +6048,57 @@
           <w:iCs/>
           <w:lang w:val="en-US" w:eastAsia="zh-CN"/>
         </w:rPr>
-        <w:t xml:space="preserve">Walker</w:t>
-      </w:r>
-      <w:r>
-        <w:rPr>
-          <w:rFonts w:ascii="Noto Serif CJK SC" w:hAnsi="Noto Serif CJK SC" w:eastAsia="Noto Serif CJK SC" w:cs="Noto Serif CJK SC"/>
-          <w:lang w:val="en-US" w:eastAsia="zh-CN"/>
-        </w:rPr>
-        <w:t xml:space="preserve"> </w:t>
-      </w:r>
-      <w:r>
-        <w:rPr>
-          <w:rFonts w:hint="eastAsia" w:ascii="Noto Serif CJK SC" w:hAnsi="Noto Serif CJK SC" w:eastAsia="Noto Serif CJK SC" w:cs="Noto Serif CJK SC"/>
-          <w:lang w:val="en-US" w:eastAsia="zh-CN"/>
-        </w:rPr>
-        <w:t xml:space="preserve">一侧。它们既不提前该规则第26条的时间表，也不扩大第34条的控制范围或第45条的传票权。</w:t>
+        <w:t xml:space="preserve">Workman v. United States Postal Service</w:t>
+      </w:r>
+      <w:r>
+        <w:rPr>
+          <w:rFonts w:ascii="Noto Serif CJK SC" w:hAnsi="Noto Serif CJK SC" w:eastAsia="Noto Serif CJK SC" w:cs="Noto Serif CJK SC"/>
+          <w:lang w:val="en-US" w:eastAsia="zh-CN"/>
+        </w:rPr>
+        <w:t xml:space="preserve"> </w:t>
+      </w:r>
+      <w:r>
+        <w:rPr>
+          <w:rFonts w:hint="eastAsia" w:ascii="Noto Serif CJK SC" w:hAnsi="Noto Serif CJK SC" w:eastAsia="Noto Serif CJK SC" w:cs="Noto Serif CJK SC"/>
+          <w:lang w:val="en-US" w:eastAsia="zh-CN"/>
+        </w:rPr>
+        <w:t xml:space="preserve">一案中，第十巡回上诉法院维持了对第27条申请的驳回，因为申请人所寻求的是调查某项请求权是否存在，而不是保存已知且面临灭失风险的证言。该判决标示了第27条下联邦司法权的边界。它并未将第27条转化为一部排他性法典，统摄实定法在起诉前对受规制企业规定的每一项信息义务。若作更宽泛的解释，就会把与特定交易相联系的信息获取权纳入一项以法院授权的庭外询问为对象的规则，尽管这些权利既不要求联邦法院开展调查，也不依赖法院保存证言的权力。</w:t>
+      </w:r>
+      <w:r>
+        <w:rPr>
+          <w:rFonts w:ascii="Noto Serif CJK SC" w:hAnsi="Noto Serif CJK SC" w:eastAsia="Noto Serif CJK SC" w:cs="Noto Serif CJK SC"/>
+          <w:lang w:val="en-US" w:eastAsia="zh-CN"/>
+        </w:rPr>
+        <w:fldChar w:fldCharType="begin"/>
+      </w:r>
+      <w:r>
+        <w:rPr>
+          <w:rFonts w:ascii="Noto Serif CJK SC" w:hAnsi="Noto Serif CJK SC" w:eastAsia="Noto Serif CJK SC" w:cs="Noto Serif CJK SC"/>
+          <w:lang w:val="en-US" w:eastAsia="zh-CN"/>
+        </w:rPr>
+        <w:instrText xml:space="preserve"> NOTEREF _RefFootnote24 \f \h </w:instrText>
+      </w:r>
+      <w:r>
+        <w:rPr>
+          <w:rFonts w:ascii="Noto Serif CJK SC" w:hAnsi="Noto Serif CJK SC" w:eastAsia="Noto Serif CJK SC" w:cs="Noto Serif CJK SC"/>
+          <w:lang w:val="en-US" w:eastAsia="zh-CN"/>
+        </w:rPr>
+        <w:fldChar w:fldCharType="separate"/>
+      </w:r>
+      <w:r>
+        <w:rPr>
+          <w:rFonts w:ascii="Noto Serif CJK SC" w:hAnsi="Noto Serif CJK SC" w:eastAsia="Noto Serif CJK SC" w:cs="Noto Serif CJK SC"/>
+          <w:rStyle w:val="FootnoteReference"/>
+          <w:lang w:val="en-US" w:eastAsia="zh-CN"/>
+        </w:rPr>
+        <w:t>24</w:t>
+      </w:r>
+      <w:r>
+        <w:rPr>
+          <w:rFonts w:ascii="Noto Serif CJK SC" w:hAnsi="Noto Serif CJK SC" w:eastAsia="Noto Serif CJK SC" w:cs="Noto Serif CJK SC"/>
+          <w:lang w:val="en-US" w:eastAsia="zh-CN"/>
+        </w:rPr>
+        <w:fldChar w:fldCharType="end"/>
       </w:r>
     </w:p>
     <w:p>
@@ -6126,25 +6110,48 @@
           <w:rFonts w:hint="eastAsia" w:ascii="Noto Serif CJK SC" w:hAnsi="Noto Serif CJK SC" w:eastAsia="Noto Serif CJK SC" w:cs="Noto Serif CJK SC"/>
           <w:lang w:val="en-US" w:eastAsia="zh-CN"/>
         </w:rPr>
-        <w:t xml:space="preserve">第</w:t>
-      </w:r>
-      <w:hyperlink w:anchor="X0d45b1bf289ec41abdcdcdd96a97e2c1be6f103">
-        <w:r>
-          <w:rPr>
-            <w:rStyle w:val="Hyperlink"/>
-            <w:rFonts w:hint="eastAsia" w:ascii="Noto Serif CJK SC" w:hAnsi="Noto Serif CJK SC" w:eastAsia="Noto Serif CJK SC" w:cs="Noto Serif CJK SC"/>
-            <w:lang w:val="en-US" w:eastAsia="zh-CN"/>
-          </w:rPr>
-          <w:t xml:space="preserve">（三）</w:t>
-        </w:r>
-      </w:hyperlink>
-      <w:r>
-        <w:rPr>
-          <w:rFonts w:hint="eastAsia" w:ascii="Noto Serif CJK SC" w:hAnsi="Noto Serif CJK SC" w:eastAsia="Noto Serif CJK SC" w:cs="Noto Serif CJK SC"/>
-          <w:lang w:val="en-US" w:eastAsia="zh-CN"/>
-        </w:rPr>
-        <w:t xml:space="preserve">节所述分配方式应依功能而定。州法可以要求在争议发生数年前即生成版本、来源、控制与事件记录；创设不得放弃的请求权；授权针对拒绝答复提起诉讼；并中止该立法创设或规制之诉讼请求的时效。《联邦民事诉讼规则》第8条规制联邦执行诉讼的诉状。该规则第26、34及45条规制联邦法院的第二阶段；第26(c)条提供保护令；第15条规制修正与关系回溯。州法为当事人提供一个已经存在的客体及信息获取权；联邦程序则提供诉讼机制。</w:t>
-      </w:r>
+        <w:t xml:space="preserve">现有信息获取制定法可以说明这一区别，但并不能解决本文提出的</w:t>
+      </w:r>
+      <w:r>
+        <w:rPr>
+          <w:rFonts w:ascii="Noto Serif CJK SC" w:hAnsi="Noto Serif CJK SC" w:eastAsia="Noto Serif CJK SC" w:cs="Noto Serif CJK SC"/>
+          <w:lang w:val="en-US" w:eastAsia="zh-CN"/>
+        </w:rPr>
+        <w:t xml:space="preserve"> </w:t>
+      </w:r>
+      <w:r>
+        <w:rPr>
+          <w:rFonts w:ascii="Noto Serif CJK SC" w:hAnsi="Noto Serif CJK SC" w:eastAsia="Noto Serif CJK SC" w:cs="Noto Serif CJK SC"/>
+          <w:i/>
+          <w:iCs/>
+          <w:lang w:val="en-US" w:eastAsia="zh-CN"/>
+        </w:rPr>
+        <w:t xml:space="preserve">Erie</w:t>
+      </w:r>
+      <w:r>
+        <w:rPr>
+          <w:rFonts w:ascii="Noto Serif CJK SC" w:hAnsi="Noto Serif CJK SC" w:eastAsia="Noto Serif CJK SC" w:cs="Noto Serif CJK SC"/>
+          <w:lang w:val="en-US" w:eastAsia="zh-CN"/>
+        </w:rPr>
+        <w:t xml:space="preserve"> </w:t>
+      </w:r>
+      <w:r>
+        <w:rPr>
+          <w:rFonts w:hint="eastAsia" w:ascii="Noto Serif CJK SC" w:hAnsi="Noto Serif CJK SC" w:eastAsia="Noto Serif CJK SC" w:cs="Noto Serif CJK SC"/>
+          <w:lang w:val="en-US" w:eastAsia="zh-CN"/>
+        </w:rPr>
+        <w:t xml:space="preserve">问题。《公平信用报告法》要求消费者报告机构在收到请求并完成适当身份核验后，披露范围有限的消费者档案、信息来源及接收方。佛罗里达州法要求责任保险人在收到书面请求后三十日内，向请求人披露特定承保信息。加利福尼亚州法要求雇主保存人事记录，并向现任或前任雇员提供查阅或副本，同时明确规定，相关诉讼系属期间暂停该信息获取路径。各项制度各有其适用范围与救济；这里相关的是其制度形式。它们基于一种受规制关系规定记录或披露义务，而不是扩大法院的证据开示权。示范法采用同一区分，并且与加利福尼亚州法一样，一旦联邦诉讼系属，即明确停止平行的当事人间信息获取路径。</w:t>
+      </w:r>
+      <w:bookmarkStart w:id="237" w:name="_RefFootnote25"/>
+      <w:r>
+        <w:rPr>
+          <w:rFonts w:ascii="Noto Serif CJK SC" w:hAnsi="Noto Serif CJK SC" w:eastAsia="Noto Serif CJK SC" w:cs="Noto Serif CJK SC"/>
+          <w:rStyle w:val="FootnoteReference"/>
+          <w:lang w:val="en-US" w:eastAsia="zh-CN"/>
+        </w:rPr>
+        <w:footnoteReference w:id="151"/>
+      </w:r>
+      <w:bookmarkEnd w:id="237"/>
     </w:p>
     <w:p>
       <w:pPr>
@@ -6152,10 +6159,47 @@
       </w:pPr>
       <w:r>
         <w:rPr>
-          <w:rFonts w:hint="eastAsia" w:ascii="Noto Serif CJK SC" w:hAnsi="Noto Serif CJK SC" w:eastAsia="Noto Serif CJK SC" w:cs="Noto Serif CJK SC"/>
-          <w:lang w:val="en-US" w:eastAsia="zh-CN"/>
-        </w:rPr>
-        <w:t xml:space="preserve">保全也需要同样的区分。部署法规定基础保存义务，并可将未生成记录或过早删除记录作为运营违法予以处罚。合格请求可以产生独立的法定保全义务。但是，对于本应为预期或进行中的联邦诉讼而保全、事后灭失且无法恢复或替代的电子存储信息，《联邦民事诉讼规则》第37(e)条规制联邦诉讼措施。该规则规定不利影响与故意标准；它不创设运营义务。</w:t>
+          <w:rFonts w:ascii="Noto Serif CJK SC" w:hAnsi="Noto Serif CJK SC" w:eastAsia="Noto Serif CJK SC" w:cs="Noto Serif CJK SC"/>
+          <w:i/>
+          <w:iCs/>
+          <w:lang w:val="en-US" w:eastAsia="zh-CN"/>
+        </w:rPr>
+        <w:t xml:space="preserve">American Bank v. City of Menasha</w:t>
+      </w:r>
+      <w:r>
+        <w:rPr>
+          <w:rFonts w:ascii="Noto Serif CJK SC" w:hAnsi="Noto Serif CJK SC" w:eastAsia="Noto Serif CJK SC" w:cs="Noto Serif CJK SC"/>
+          <w:lang w:val="en-US" w:eastAsia="zh-CN"/>
+        </w:rPr>
+        <w:t xml:space="preserve"> </w:t>
+      </w:r>
+      <w:r>
+        <w:rPr>
+          <w:rFonts w:hint="eastAsia" w:ascii="Noto Serif CJK SC" w:hAnsi="Noto Serif CJK SC" w:eastAsia="Noto Serif CJK SC" w:cs="Noto Serif CJK SC"/>
+          <w:lang w:val="en-US" w:eastAsia="zh-CN"/>
+        </w:rPr>
+        <w:t xml:space="preserve">提供了有益但有限的类比。第七巡回上诉法院在解释联邦证据开示中止规定时认为，公开记录请求并不会仅因请求人拟将材料用于诉讼而成为证据开示。该法院同时警告，如果州将证据开示程序伪装成查阅权，应以实质为准。部署责任入口只有在其运行结构与自身描述相符时，才能通过这项检验：字段范围须在任何争议发生前固定；义务须适用于诉讼之外；第一阶段不得由针对具体请求权的相关性与比例原则加以界定。第一部分讨论的伊利诺伊州、得克萨斯州和纽约州诉前程序承担不同功能。由于这些程序授权法院命令开展诉前证据开示，它们可以证明封闭式身份识别程序具有可管理性；但它们并不构成本方案在联邦法下的制度形态。</w:t>
+      </w:r>
+      <w:r>
+        <w:rPr>
+          <w:rFonts w:ascii="Noto Serif CJK SC" w:hAnsi="Noto Serif CJK SC" w:eastAsia="Noto Serif CJK SC" w:cs="Noto Serif CJK SC"/>
+          <w:lang w:val="en-US" w:eastAsia="zh-CN"/>
+        </w:rPr>
+        <w:fldChar w:fldCharType="begin"/>
+      </w:r>
+      <w:r>
+        <w:rPr>
+          <w:rFonts w:ascii="Noto Serif CJK SC" w:hAnsi="Noto Serif CJK SC" w:eastAsia="Noto Serif CJK SC" w:cs="Noto Serif CJK SC"/>
+          <w:lang w:val="en-US" w:eastAsia="zh-CN"/>
+        </w:rPr>
+        <w:instrText xml:space="preserve"> NOTEREF _RefFootnote25 \f \h </w:instrText>
+      </w:r>
+      <w:r>
+        <w:rPr>
+          <w:rFonts w:ascii="Noto Serif CJK SC" w:hAnsi="Noto Serif CJK SC" w:eastAsia="Noto Serif CJK SC" w:cs="Noto Serif CJK SC"/>
+          <w:lang w:val="en-US" w:eastAsia="zh-CN"/>
+        </w:rPr>
+        <w:fldChar w:fldCharType="separate"/>
       </w:r>
       <w:r>
         <w:rPr>
@@ -6163,22 +6207,230 @@
           <w:rStyle w:val="FootnoteReference"/>
           <w:lang w:val="en-US" w:eastAsia="zh-CN"/>
         </w:rPr>
+        <w:t>25</w:t>
+      </w:r>
+      <w:r>
+        <w:rPr>
+          <w:rFonts w:ascii="Noto Serif CJK SC" w:hAnsi="Noto Serif CJK SC" w:eastAsia="Noto Serif CJK SC" w:cs="Noto Serif CJK SC"/>
+          <w:lang w:val="en-US" w:eastAsia="zh-CN"/>
+        </w:rPr>
+        <w:fldChar w:fldCharType="end"/>
+      </w:r>
+    </w:p>
+    <w:p>
+      <w:pPr>
+        <w:pStyle w:val="BodyText"/>
+      </w:pPr>
+      <w:r>
+        <w:rPr>
+          <w:rFonts w:ascii="Noto Serif CJK SC" w:hAnsi="Noto Serif CJK SC" w:eastAsia="Noto Serif CJK SC" w:cs="Noto Serif CJK SC"/>
+          <w:i/>
+          <w:iCs/>
+          <w:lang w:val="en-US" w:eastAsia="zh-CN"/>
+        </w:rPr>
+        <w:t xml:space="preserve">Berk</w:t>
+      </w:r>
+      <w:r>
+        <w:rPr>
+          <w:rFonts w:ascii="Noto Serif CJK SC" w:hAnsi="Noto Serif CJK SC" w:eastAsia="Noto Serif CJK SC" w:cs="Noto Serif CJK SC"/>
+          <w:lang w:val="en-US" w:eastAsia="zh-CN"/>
+        </w:rPr>
+        <w:t xml:space="preserve"> </w:t>
+      </w:r>
+      <w:r>
+        <w:rPr>
+          <w:rFonts w:hint="eastAsia" w:ascii="Noto Serif CJK SC" w:hAnsi="Noto Serif CJK SC" w:eastAsia="Noto Serif CJK SC" w:cs="Noto Serif CJK SC"/>
+          <w:lang w:val="en-US" w:eastAsia="zh-CN"/>
+        </w:rPr>
+        <w:t xml:space="preserve">本身也提供了正面范式。最高法院在区分</w:t>
+      </w:r>
+      <w:r>
+        <w:rPr>
+          <w:rFonts w:ascii="Noto Serif CJK SC" w:hAnsi="Noto Serif CJK SC" w:eastAsia="Noto Serif CJK SC" w:cs="Noto Serif CJK SC"/>
+          <w:lang w:val="en-US" w:eastAsia="zh-CN"/>
+        </w:rPr>
+        <w:t xml:space="preserve"> </w:t>
+      </w:r>
+      <w:r>
+        <w:rPr>
+          <w:rFonts w:ascii="Noto Serif CJK SC" w:hAnsi="Noto Serif CJK SC" w:eastAsia="Noto Serif CJK SC" w:cs="Noto Serif CJK SC"/>
+          <w:i/>
+          <w:iCs/>
+          <w:lang w:val="en-US" w:eastAsia="zh-CN"/>
+        </w:rPr>
+        <w:t xml:space="preserve">Cohen v. Beneficial Industrial Loan Corp.</w:t>
+      </w:r>
+      <w:r>
+        <w:rPr>
+          <w:rFonts w:ascii="Noto Serif CJK SC" w:hAnsi="Noto Serif CJK SC" w:eastAsia="Noto Serif CJK SC" w:cs="Noto Serif CJK SC"/>
+          <w:lang w:val="en-US" w:eastAsia="zh-CN"/>
+        </w:rPr>
+        <w:t xml:space="preserve"> </w:t>
+      </w:r>
+      <w:r>
+        <w:rPr>
+          <w:rFonts w:hint="eastAsia" w:ascii="Noto Serif CJK SC" w:hAnsi="Noto Serif CJK SC" w:eastAsia="Noto Serif CJK SC" w:cs="Noto Serif CJK SC"/>
+          <w:lang w:val="en-US" w:eastAsia="zh-CN"/>
+        </w:rPr>
+        <w:t xml:space="preserve">时解释说，州法创设的是一项法律责任，而第23条规制向法院披露以及向利害关系人发出通知，二者因而不存在冲突。按示范文本起草时，部署责任入口属于这条界线的同一侧。适用范围、合规通知、交付和不履行四项条件一旦具备，州法违法即告完成。执行诉讼请求以法定事件回执和保管人图谱作为该请求权的救济；它并不要求法院强制提供用以证明另一项请求权的证据。第8条规制执行诉讼的诉状，第12条规制驳回，第65条及通常救济规则规制临时救济，其余联邦规则规制裁判程序。州法提供义务与救济；联邦法提供诉讼机制。</w:t>
+      </w:r>
+      <w:r>
+        <w:rPr>
+          <w:rFonts w:ascii="Noto Serif CJK SC" w:hAnsi="Noto Serif CJK SC" w:eastAsia="Noto Serif CJK SC" w:cs="Noto Serif CJK SC"/>
+          <w:rStyle w:val="FootnoteReference"/>
+          <w:lang w:val="en-US" w:eastAsia="zh-CN"/>
+        </w:rPr>
+        <w:footnoteReference w:id="152"/>
+      </w:r>
+    </w:p>
+    <w:p>
+      <w:pPr>
+        <w:pStyle w:val="BodyText"/>
+      </w:pPr>
+      <w:r>
+        <w:rPr>
+          <w:rFonts w:hint="eastAsia" w:ascii="Noto Serif CJK SC" w:hAnsi="Noto Serif CJK SC" w:eastAsia="Noto Serif CJK SC" w:cs="Noto Serif CJK SC"/>
+          <w:lang w:val="en-US" w:eastAsia="zh-CN"/>
+        </w:rPr>
+        <w:t xml:space="preserve">仅把材料提供称为“救济”，本身并不足够。两项客观特征将部署责任入口与独立的证据开示请求区分开来。第一，指定文件在事件发生前即固定第一阶段的字段范围。两名受影响者即使提出不同的责任理论，对于同一类事件也会取得相同的身份、版本、事件、保管人和控制字段，尽管任何一人均可只请求其中较少的字段。第二，即便此后没有实体问题诉讼，该义务仍发挥同样作用。如果某一字段的范围会随诉状所列构成要件、抗辩、相关性主张或比例原则证明而变化，该字段就不是第一阶段字段；它属于第二阶段或通常证据开示。内容固定且独立于诉讼运行，因而是这条边界本身的构成要素，而不是执行过程中贴上的标签。</w:t>
+      </w:r>
+    </w:p>
+    <w:p>
+      <w:pPr>
+        <w:pStyle w:val="BodyText"/>
+      </w:pPr>
+      <w:r>
+        <w:rPr>
+          <w:rFonts w:hint="eastAsia" w:ascii="Noto Serif CJK SC" w:hAnsi="Noto Serif CJK SC" w:eastAsia="Noto Serif CJK SC" w:cs="Noto Serif CJK SC"/>
+          <w:lang w:val="en-US" w:eastAsia="zh-CN"/>
+        </w:rPr>
+        <w:t xml:space="preserve">在联邦规则已经回答争议问题之处，示范文本随即退让。一旦涉及该不利事件的诉讼正在联邦法院系属，请求人不得再向另一当事人交付第一阶段通知，将其作为规避第26(d)条、第26(b)(1)条或第34条的额外路径。对于起诉后首次向该当事人请求的字段，首次答复义务应当通过《联邦民事诉讼规则》履行，并以该规则为限。起诉前已经完成的拒绝答复行为，仍构成本法创设的一项履行救济请求权；为证明该请求权或基础实体问题而请求的其他信息，则依据联邦规则取得。这条边界被明确写入第7条和第10条，而不是留给一项概括性权利保留条款处理。</w:t>
+      </w:r>
+    </w:p>
+    <w:p>
+      <w:pPr>
+        <w:pStyle w:val="BodyText"/>
+      </w:pPr>
+      <w:r>
+        <w:rPr>
+          <w:rFonts w:hint="eastAsia" w:ascii="Noto Serif CJK SC" w:hAnsi="Noto Serif CJK SC" w:eastAsia="Noto Serif CJK SC" w:cs="Noto Serif CJK SC"/>
+          <w:lang w:val="en-US" w:eastAsia="zh-CN"/>
+        </w:rPr>
+        <w:t xml:space="preserve">具体运行方式十分清楚。遭到拒绝的求职者如果交付合规通知，并在提起诉讼前未收到答复，只要管辖权与美国宪法第三条允许，即可在日后提起的联邦诉讼中一并主张已经完成的信息获取违法；所请求的救济就是事件回执与保管人图谱。求职者如果先提起就业诉讼，则不得针对雇主使用第一阶段，以早于联邦证据开示所允许的时间或以更广的范围取得字段。在这两种次序中，雇主依据第2条承担的记录生成与调取义务都已经使部署具备可观察性。第一种次序执行已经发生的法定义务；第二种次序则针对一份已经存在且可以识别的记录适用《联邦民事诉讼规则》。</w:t>
+      </w:r>
+    </w:p>
+    <w:p>
+      <w:pPr>
+        <w:pStyle w:val="BodyText"/>
+      </w:pPr>
+      <w:r>
+        <w:rPr>
+          <w:rFonts w:hint="eastAsia" w:ascii="Noto Serif CJK SC" w:hAnsi="Noto Serif CJK SC" w:eastAsia="Noto Serif CJK SC" w:cs="Noto Serif CJK SC"/>
+          <w:lang w:val="en-US" w:eastAsia="zh-CN"/>
+        </w:rPr>
+        <w:t xml:space="preserve">调取架构同样使州法规则与第34条形成互补。第2条要求运营者在部署前取得调取所界定供应商字段的合同权利。本法并不宣称该权利当然构成第34条意义上的控制；它改变的是联邦检验所适用的事实。在以答复方是否拥有按需取得文件的法律权利为标准的巡回法院，一项有效调取条款可以提供该项权利。在考察实际取得能力与交易惯例的巡回法院，该条款、答复机制及实际做法则提供相关证据。联邦法院仍应依据所属巡回法院的法律，独立判断是否构成占有、保管或控制。州合同法创设调取权；第34条决定其程序后果。</w:t>
+      </w:r>
+      <w:r>
+        <w:rPr>
+          <w:rFonts w:ascii="Noto Serif CJK SC" w:hAnsi="Noto Serif CJK SC" w:eastAsia="Noto Serif CJK SC" w:cs="Noto Serif CJK SC"/>
+          <w:rStyle w:val="FootnoteReference"/>
+          <w:lang w:val="en-US" w:eastAsia="zh-CN"/>
+        </w:rPr>
+        <w:footnoteReference w:id="153"/>
+      </w:r>
+    </w:p>
+    <w:p>
+      <w:pPr>
+        <w:pStyle w:val="BodyText"/>
+      </w:pPr>
+      <w:r>
+        <w:rPr>
+          <w:rFonts w:hint="eastAsia" w:ascii="Noto Serif CJK SC" w:hAnsi="Noto Serif CJK SC" w:eastAsia="Noto Serif CJK SC" w:cs="Noto Serif CJK SC"/>
+          <w:lang w:val="en-US" w:eastAsia="zh-CN"/>
+        </w:rPr>
+        <w:t xml:space="preserve">裁判机构边界亦由此确定。主要的采纳机关是州立法机关，通常的执行机构则是行业性指定依州法确定的机构。在合规案件中不会有任何裁判机构介入：运营者交付回执，日后任何联邦实体问题诉讼均依通常证据开示程序进行。联邦法院只有基于多元国籍管辖或补充管辖，才会审理州法上的信息获取请求；国会也可以为联邦请求权采用同一架构，在此情形下并不存在</w:t>
+      </w:r>
+      <w:r>
+        <w:rPr>
+          <w:rFonts w:ascii="Noto Serif CJK SC" w:hAnsi="Noto Serif CJK SC" w:eastAsia="Noto Serif CJK SC" w:cs="Noto Serif CJK SC"/>
+          <w:lang w:val="en-US" w:eastAsia="zh-CN"/>
+        </w:rPr>
+        <w:t xml:space="preserve"> </w:t>
+      </w:r>
+      <w:r>
+        <w:rPr>
+          <w:rFonts w:ascii="Noto Serif CJK SC" w:hAnsi="Noto Serif CJK SC" w:eastAsia="Noto Serif CJK SC" w:cs="Noto Serif CJK SC"/>
+          <w:i/>
+          <w:iCs/>
+          <w:lang w:val="en-US" w:eastAsia="zh-CN"/>
+        </w:rPr>
+        <w:t xml:space="preserve">Erie</w:t>
+      </w:r>
+      <w:r>
+        <w:rPr>
+          <w:rFonts w:ascii="Noto Serif CJK SC" w:hAnsi="Noto Serif CJK SC" w:eastAsia="Noto Serif CJK SC" w:cs="Noto Serif CJK SC"/>
+          <w:lang w:val="en-US" w:eastAsia="zh-CN"/>
+        </w:rPr>
+        <w:t xml:space="preserve"> </w:t>
+      </w:r>
+      <w:r>
+        <w:rPr>
+          <w:rFonts w:hint="eastAsia" w:ascii="Noto Serif CJK SC" w:hAnsi="Noto Serif CJK SC" w:eastAsia="Noto Serif CJK SC" w:cs="Noto Serif CJK SC"/>
+          <w:lang w:val="en-US" w:eastAsia="zh-CN"/>
+        </w:rPr>
+        <w:t xml:space="preserve">问题。州制定法既不创设事项管辖权，也不创设对人管辖权。美国宪法第三条仍独立要求存在具体损害。联邦原告应当主张，拒绝答复妨碍了某项明确用途——识别、更正、质疑、申诉或寻求救济——或者造成合理的实际支出。州法院则适用各自的诉讼资格规则。</w:t>
+      </w:r>
+      <w:r>
+        <w:rPr>
+          <w:rFonts w:ascii="Noto Serif CJK SC" w:hAnsi="Noto Serif CJK SC" w:eastAsia="Noto Serif CJK SC" w:cs="Noto Serif CJK SC"/>
+          <w:rStyle w:val="FootnoteReference"/>
+          <w:lang w:val="en-US" w:eastAsia="zh-CN"/>
+        </w:rPr>
+        <w:footnoteReference w:id="154"/>
+      </w:r>
+    </w:p>
+    <w:p>
+      <w:pPr>
+        <w:pStyle w:val="BodyText"/>
+      </w:pPr>
+      <w:r>
+        <w:rPr>
+          <w:rFonts w:hint="eastAsia" w:ascii="Noto Serif CJK SC" w:hAnsi="Noto Serif CJK SC" w:eastAsia="Noto Serif CJK SC" w:cs="Noto Serif CJK SC"/>
+          <w:lang w:val="en-US" w:eastAsia="zh-CN"/>
+        </w:rPr>
+        <w:t xml:space="preserve">记录保全与诉讼时效遵循同一分配。州法可以将基础记录生成与留存规定为受规制运营的条件，并可在收到合格通知后延长规定的留存期间。电子存储信息如在预期或进行联邦诉讼期间灭失，第37(e)条规定联邦诉讼中可以采取的措施；州制定法不另行规定相冲突的不利推定或案件管理制裁。在运营者答复期间，州可以中止本法创设或明确规制之诉讼请求的时效。</w:t>
+      </w:r>
+      <w:r>
+        <w:rPr>
+          <w:rFonts w:ascii="Noto Serif CJK SC" w:hAnsi="Noto Serif CJK SC" w:eastAsia="Noto Serif CJK SC" w:cs="Noto Serif CJK SC"/>
+          <w:i/>
+          <w:iCs/>
+          <w:lang w:val="en-US" w:eastAsia="zh-CN"/>
+        </w:rPr>
+        <w:t xml:space="preserve">Walker v. Armco Steel Corp.</w:t>
+      </w:r>
+      <w:r>
+        <w:rPr>
+          <w:rFonts w:ascii="Noto Serif CJK SC" w:hAnsi="Noto Serif CJK SC" w:eastAsia="Noto Serif CJK SC" w:cs="Noto Serif CJK SC"/>
+          <w:lang w:val="en-US" w:eastAsia="zh-CN"/>
+        </w:rPr>
+        <w:t xml:space="preserve"> </w:t>
+      </w:r>
+      <w:r>
+        <w:rPr>
+          <w:rFonts w:hint="eastAsia" w:ascii="Noto Serif CJK SC" w:hAnsi="Noto Serif CJK SC" w:eastAsia="Noto Serif CJK SC" w:cs="Noto Serif CJK SC"/>
+          <w:lang w:val="en-US" w:eastAsia="zh-CN"/>
+        </w:rPr>
+        <w:t xml:space="preserve">仍是相关的适用范围先例：第3条并未回答州法时效在何时满足，因而适用州法规则。第15条则继续规制后续联邦诉讼中的修正与关系回溯。</w:t>
+      </w:r>
+      <w:r>
+        <w:rPr>
+          <w:rFonts w:ascii="Noto Serif CJK SC" w:hAnsi="Noto Serif CJK SC" w:eastAsia="Noto Serif CJK SC" w:cs="Noto Serif CJK SC"/>
+          <w:rStyle w:val="FootnoteReference"/>
+          <w:lang w:val="en-US" w:eastAsia="zh-CN"/>
+        </w:rPr>
         <w:footnoteReference w:id="155"/>
       </w:r>
-      <w:r>
-        <w:rPr>
-          <w:rFonts w:ascii="Noto Serif CJK SC" w:hAnsi="Noto Serif CJK SC" w:eastAsia="Noto Serif CJK SC" w:cs="Noto Serif CJK SC"/>
-          <w:lang w:val="en-US" w:eastAsia="zh-CN"/>
-        </w:rPr>
-        <w:t xml:space="preserve"> </w:t>
-      </w:r>
-      <w:r>
-        <w:rPr>
-          <w:rFonts w:hint="eastAsia" w:ascii="Noto Serif CJK SC" w:hAnsi="Noto Serif CJK SC" w:eastAsia="Noto Serif CJK SC" w:cs="Noto Serif CJK SC"/>
-          <w:lang w:val="en-US" w:eastAsia="zh-CN"/>
-        </w:rPr>
-        <w:t xml:space="preserve">因此，示范文本针对部署违法规定监管救济与信息获取救济，同时把联邦层面的不利推定和案件管理措施留给第37(e)条。</w:t>
-      </w:r>
     </w:p>
     <w:p>
       <w:pPr>
@@ -6189,19 +6441,37 @@
           <w:rFonts w:hint="eastAsia" w:ascii="Noto Serif CJK SC" w:hAnsi="Noto Serif CJK SC" w:eastAsia="Noto Serif CJK SC" w:cs="Noto Serif CJK SC"/>
           <w:lang w:val="en-US" w:eastAsia="zh-CN"/>
         </w:rPr>
-        <w:t xml:space="preserve">诉讼时效问题应遵循立法权限。州可以在运营者提供首次答复期间，中止其创设或规制的州法诉讼请求时效。州不能承诺中止独立联邦请求权的时效，也不能规定针对后来具名当事人的自动关系回溯。需要全国统一规则时，国会可以将联邦部署责任入口与联邦时效中止规则相结合。无论采取何种形式，信息获取期间都使受影响者有时间利用答复，同时保留《联邦民事诉讼规则》第15条在后续联邦诉讼中的作用。</w:t>
-      </w:r>
-    </w:p>
-    <w:p>
-      <w:pPr>
-        <w:pStyle w:val="BodyText"/>
-      </w:pPr>
-      <w:r>
-        <w:rPr>
-          <w:rFonts w:hint="eastAsia" w:ascii="Noto Serif CJK SC" w:hAnsi="Noto Serif CJK SC" w:eastAsia="Noto Serif CJK SC" w:cs="Noto Serif CJK SC"/>
-          <w:lang w:val="en-US" w:eastAsia="zh-CN"/>
-        </w:rPr>
-        <w:t xml:space="preserve">由此形成的分工十分具体。部署法确保重大系统可被识别，并赋予一项明确的信息获取权。联邦程序规制联邦执行诉讼及其后的任何实体诉讼请求。同样的分工也保留了引言所述实体法争议：信息获取权提供部署和记录，使准据责任规则得以运作；实体问题防火墙既不选择该规则，也不改变其构成要件。首次答复带来的是此前缺失的记录，而不是一套替代性民事诉讼法典。</w:t>
+        <w:t xml:space="preserve">这一分配不取决于下级法院如何将</w:t>
+      </w:r>
+      <w:r>
+        <w:rPr>
+          <w:rFonts w:ascii="Noto Serif CJK SC" w:hAnsi="Noto Serif CJK SC" w:eastAsia="Noto Serif CJK SC" w:cs="Noto Serif CJK SC"/>
+          <w:lang w:val="en-US" w:eastAsia="zh-CN"/>
+        </w:rPr>
+        <w:t xml:space="preserve"> </w:t>
+      </w:r>
+      <w:r>
+        <w:rPr>
+          <w:rFonts w:ascii="Noto Serif CJK SC" w:hAnsi="Noto Serif CJK SC" w:eastAsia="Noto Serif CJK SC" w:cs="Noto Serif CJK SC"/>
+          <w:i/>
+          <w:iCs/>
+          <w:lang w:val="en-US" w:eastAsia="zh-CN"/>
+        </w:rPr>
+        <w:t xml:space="preserve">Berk</w:t>
+      </w:r>
+      <w:r>
+        <w:rPr>
+          <w:rFonts w:ascii="Noto Serif CJK SC" w:hAnsi="Noto Serif CJK SC" w:eastAsia="Noto Serif CJK SC" w:cs="Noto Serif CJK SC"/>
+          <w:lang w:val="en-US" w:eastAsia="zh-CN"/>
+        </w:rPr>
+        <w:t xml:space="preserve"> </w:t>
+      </w:r>
+      <w:r>
+        <w:rPr>
+          <w:rFonts w:hint="eastAsia" w:ascii="Noto Serif CJK SC" w:hAnsi="Noto Serif CJK SC" w:eastAsia="Noto Serif CJK SC" w:cs="Noto Serif CJK SC"/>
+          <w:lang w:val="en-US" w:eastAsia="zh-CN"/>
+        </w:rPr>
+        <w:t xml:space="preserve">扩展适用于反策略性阻止公众参与诉讼（anti-SLAPP）制定法或其他州法程序门槛机制。这套四步次序同样不依赖联邦法院在诉讼开始后接受针对另一当事人的平行信息获取渠道。规则更为狭窄，也更加持久：州可以要求受规制企业使高影响部署具备可观察性，并在联邦诉讼当事人间证据开示之外提供内容固定的回执；一旦联邦当事人间证据开示规制同一请求，《联邦民事诉讼规则》即成为排他性路径。部署责任入口生成记录，也生成联邦程序首先可以处理的信息客体。联邦证据开示开始之处，即为部署责任入口的终点。</w:t>
       </w:r>
     </w:p>
     <w:bookmarkEnd w:id="156"/>
@@ -14146,12 +14416,12 @@
       </w:r>
       <w:r>
         <w:rPr>
-          <w:rFonts w:hint="eastAsia" w:ascii="Noto Serif CJK SC" w:hAnsi="Noto Serif CJK SC" w:eastAsia="Noto Serif CJK SC" w:cs="Noto Serif CJK SC"/>
-          <w:lang w:val="en-US" w:eastAsia="zh-CN"/>
-          <w:sz w:val="20"/>
-          <w:szCs w:val="20"/>
-        </w:rPr>
-        <w:t xml:space="preserve">例如，参见</w:t>
+          <w:rFonts w:ascii="Noto Serif CJK SC" w:hAnsi="Noto Serif CJK SC" w:eastAsia="Noto Serif CJK SC" w:cs="Noto Serif CJK SC"/>
+          <w:lang w:val="en-US" w:eastAsia="zh-CN"/>
+          <w:sz w:val="20"/>
+          <w:szCs w:val="20"/>
+        </w:rPr>
+        <w:t xml:space="preserve">See</w:t>
       </w:r>
       <w:r>
         <w:rPr>
@@ -14171,25 +14441,177 @@
           <w:sz w:val="20"/>
           <w:szCs w:val="20"/>
         </w:rPr>
-        <w:t xml:space="preserve">Pledger v. Lynch,</w:t>
-      </w:r>
-      <w:r>
-        <w:rPr>
-          <w:rFonts w:ascii="Noto Serif CJK SC" w:hAnsi="Noto Serif CJK SC" w:eastAsia="Noto Serif CJK SC" w:cs="Noto Serif CJK SC"/>
-          <w:lang w:val="en-US" w:eastAsia="zh-CN"/>
-          <w:sz w:val="20"/>
-          <w:szCs w:val="20"/>
-        </w:rPr>
-        <w:t xml:space="preserve"> </w:t>
-      </w:r>
-      <w:r>
-        <w:rPr>
-          <w:rFonts w:ascii="Noto Serif CJK SC" w:hAnsi="Noto Serif CJK SC" w:eastAsia="Noto Serif CJK SC" w:cs="Noto Serif CJK SC"/>
-          <w:lang w:val="en-US" w:eastAsia="zh-CN"/>
-          <w:sz w:val="20"/>
-          <w:szCs w:val="20"/>
-        </w:rPr>
-        <w:t xml:space="preserve">5 F.4th 511, 516–24 (4th Cir. 2021).</w:t>
+        <w:t xml:space="preserve">Berk v. Choy</w:t>
+      </w:r>
+      <w:r>
+        <w:rPr>
+          <w:rFonts w:ascii="Noto Serif CJK SC" w:hAnsi="Noto Serif CJK SC" w:eastAsia="Noto Serif CJK SC" w:cs="Noto Serif CJK SC"/>
+          <w:lang w:val="en-US" w:eastAsia="zh-CN"/>
+          <w:sz w:val="20"/>
+          <w:szCs w:val="20"/>
+        </w:rPr>
+        <w:t xml:space="preserve">, 607 U.S. 187, 191–200 </w:t>
+      </w:r>
+      <w:r>
+        <w:rPr>
+          <w:rFonts w:hint="eastAsia" w:ascii="Noto Serif CJK SC" w:hAnsi="Noto Serif CJK SC" w:eastAsia="Noto Serif CJK SC" w:cs="Noto Serif CJK SC"/>
+          <w:lang w:val="en-US" w:eastAsia="zh-CN"/>
+          <w:sz w:val="20"/>
+          <w:szCs w:val="20"/>
+        </w:rPr>
+        <w:t xml:space="preserve">(2026)（撤销对该多元国籍管辖诉讼的驳回，并认定《联邦民事诉讼规则》第8条排除适用</w:t>
+      </w:r>
+      <w:r>
+        <w:rPr>
+          <w:rFonts w:ascii="Noto Serif CJK SC" w:hAnsi="Noto Serif CJK SC" w:eastAsia="Noto Serif CJK SC" w:cs="Noto Serif CJK SC"/>
+          <w:lang w:val="en-US" w:eastAsia="zh-CN"/>
+          <w:sz w:val="20"/>
+          <w:szCs w:val="20"/>
+        </w:rPr>
+        <w:t xml:space="preserve"> Del. Code tit. 18, § </w:t>
+      </w:r>
+      <w:r>
+        <w:rPr>
+          <w:rFonts w:hint="eastAsia" w:ascii="Noto Serif CJK SC" w:hAnsi="Noto Serif CJK SC" w:eastAsia="Noto Serif CJK SC" w:cs="Noto Serif CJK SC"/>
+          <w:lang w:val="en-US" w:eastAsia="zh-CN"/>
+          <w:sz w:val="20"/>
+          <w:szCs w:val="20"/>
+        </w:rPr>
+        <w:t xml:space="preserve">6853）;</w:t>
+      </w:r>
+      <w:r>
+        <w:rPr>
+          <w:rFonts w:ascii="Noto Serif CJK SC" w:hAnsi="Noto Serif CJK SC" w:eastAsia="Noto Serif CJK SC" w:cs="Noto Serif CJK SC"/>
+          <w:lang w:val="en-US" w:eastAsia="zh-CN"/>
+          <w:sz w:val="20"/>
+          <w:szCs w:val="20"/>
+        </w:rPr>
+        <w:t xml:space="preserve"> </w:t>
+      </w:r>
+      <w:r>
+        <w:rPr>
+          <w:rFonts w:ascii="Noto Serif CJK SC" w:hAnsi="Noto Serif CJK SC" w:eastAsia="Noto Serif CJK SC" w:cs="Noto Serif CJK SC"/>
+          <w:i/>
+          <w:iCs/>
+          <w:lang w:val="en-US" w:eastAsia="zh-CN"/>
+          <w:sz w:val="20"/>
+          <w:szCs w:val="20"/>
+        </w:rPr>
+        <w:t xml:space="preserve">id.</w:t>
+      </w:r>
+      <w:r>
+        <w:rPr>
+          <w:rFonts w:ascii="Noto Serif CJK SC" w:hAnsi="Noto Serif CJK SC" w:eastAsia="Noto Serif CJK SC" w:cs="Noto Serif CJK SC"/>
+          <w:lang w:val="en-US" w:eastAsia="zh-CN"/>
+          <w:sz w:val="20"/>
+          <w:szCs w:val="20"/>
+        </w:rPr>
+        <w:t xml:space="preserve"> </w:t>
+      </w:r>
+      <w:r>
+        <w:rPr>
+          <w:rFonts w:ascii="Noto Serif CJK SC" w:hAnsi="Noto Serif CJK SC" w:eastAsia="Noto Serif CJK SC" w:cs="Noto Serif CJK SC"/>
+          <w:lang w:val="en-US" w:eastAsia="zh-CN"/>
+          <w:sz w:val="20"/>
+          <w:szCs w:val="20"/>
+        </w:rPr>
+        <w:t xml:space="preserve">at 200–12 (Jackson, J., concurring in the </w:t>
+      </w:r>
+      <w:r>
+        <w:rPr>
+          <w:rFonts w:hint="eastAsia" w:ascii="Noto Serif CJK SC" w:hAnsi="Noto Serif CJK SC" w:eastAsia="Noto Serif CJK SC" w:cs="Noto Serif CJK SC"/>
+          <w:lang w:val="en-US" w:eastAsia="zh-CN"/>
+          <w:sz w:val="20"/>
+          <w:szCs w:val="20"/>
+        </w:rPr>
+        <w:t xml:space="preserve">judgment)（认为冲突存在于第3条和第12条，而非第8条）;</w:t>
+      </w:r>
+      <w:r>
+        <w:rPr>
+          <w:rFonts w:ascii="Noto Serif CJK SC" w:hAnsi="Noto Serif CJK SC" w:eastAsia="Noto Serif CJK SC" w:cs="Noto Serif CJK SC"/>
+          <w:lang w:val="en-US" w:eastAsia="zh-CN"/>
+          <w:sz w:val="20"/>
+          <w:szCs w:val="20"/>
+        </w:rPr>
+        <w:t xml:space="preserve"> </w:t>
+      </w:r>
+      <w:r>
+        <w:rPr>
+          <w:rFonts w:ascii="Noto Serif CJK SC" w:hAnsi="Noto Serif CJK SC" w:eastAsia="Noto Serif CJK SC" w:cs="Noto Serif CJK SC"/>
+          <w:i/>
+          <w:iCs/>
+          <w:lang w:val="en-US" w:eastAsia="zh-CN"/>
+          <w:sz w:val="20"/>
+          <w:szCs w:val="20"/>
+        </w:rPr>
+        <w:t xml:space="preserve">Hanna v. Plumer</w:t>
+      </w:r>
+      <w:r>
+        <w:rPr>
+          <w:rFonts w:ascii="Noto Serif CJK SC" w:hAnsi="Noto Serif CJK SC" w:eastAsia="Noto Serif CJK SC" w:cs="Noto Serif CJK SC"/>
+          <w:lang w:val="en-US" w:eastAsia="zh-CN"/>
+          <w:sz w:val="20"/>
+          <w:szCs w:val="20"/>
+        </w:rPr>
+        <w:t xml:space="preserve">, 380 U.S. 460, 469–74 (1965);</w:t>
+      </w:r>
+      <w:r>
+        <w:rPr>
+          <w:rFonts w:ascii="Noto Serif CJK SC" w:hAnsi="Noto Serif CJK SC" w:eastAsia="Noto Serif CJK SC" w:cs="Noto Serif CJK SC"/>
+          <w:lang w:val="en-US" w:eastAsia="zh-CN"/>
+          <w:sz w:val="20"/>
+          <w:szCs w:val="20"/>
+        </w:rPr>
+        <w:t xml:space="preserve"> </w:t>
+      </w:r>
+      <w:r>
+        <w:rPr>
+          <w:rFonts w:ascii="Noto Serif CJK SC" w:hAnsi="Noto Serif CJK SC" w:eastAsia="Noto Serif CJK SC" w:cs="Noto Serif CJK SC"/>
+          <w:i/>
+          <w:iCs/>
+          <w:lang w:val="en-US" w:eastAsia="zh-CN"/>
+          <w:sz w:val="20"/>
+          <w:szCs w:val="20"/>
+        </w:rPr>
+        <w:t xml:space="preserve">Shady Grove Orthopedic Associates, P.A. v. Allstate Insurance Co.</w:t>
+      </w:r>
+      <w:r>
+        <w:rPr>
+          <w:rFonts w:ascii="Noto Serif CJK SC" w:hAnsi="Noto Serif CJK SC" w:eastAsia="Noto Serif CJK SC" w:cs="Noto Serif CJK SC"/>
+          <w:lang w:val="en-US" w:eastAsia="zh-CN"/>
+          <w:sz w:val="20"/>
+          <w:szCs w:val="20"/>
+        </w:rPr>
+        <w:t xml:space="preserve">, 559 U.S. 393, 398–410 (2010);</w:t>
+      </w:r>
+      <w:r>
+        <w:rPr>
+          <w:rFonts w:ascii="Noto Serif CJK SC" w:hAnsi="Noto Serif CJK SC" w:eastAsia="Noto Serif CJK SC" w:cs="Noto Serif CJK SC"/>
+          <w:lang w:val="en-US" w:eastAsia="zh-CN"/>
+          <w:sz w:val="20"/>
+          <w:szCs w:val="20"/>
+        </w:rPr>
+        <w:t xml:space="preserve"> </w:t>
+      </w:r>
+      <w:r>
+        <w:rPr>
+          <w:rFonts w:ascii="Noto Serif CJK SC" w:hAnsi="Noto Serif CJK SC" w:eastAsia="Noto Serif CJK SC" w:cs="Noto Serif CJK SC"/>
+          <w:i/>
+          <w:iCs/>
+          <w:lang w:val="en-US" w:eastAsia="zh-CN"/>
+          <w:sz w:val="20"/>
+          <w:szCs w:val="20"/>
+        </w:rPr>
+        <w:t xml:space="preserve">Sibbach v. Wilson &amp; Co.</w:t>
+      </w:r>
+      <w:r>
+        <w:rPr>
+          <w:rFonts w:ascii="Noto Serif CJK SC" w:hAnsi="Noto Serif CJK SC" w:eastAsia="Noto Serif CJK SC" w:cs="Noto Serif CJK SC"/>
+          <w:lang w:val="en-US" w:eastAsia="zh-CN"/>
+          <w:sz w:val="20"/>
+          <w:szCs w:val="20"/>
+        </w:rPr>
+        <w:t xml:space="preserve">, 312 U.S. 1, 14–16 (1941).</w:t>
       </w:r>
     </w:p>
   </w:footnote>
@@ -14219,21 +14641,50 @@
       </w:r>
       <w:r>
         <w:rPr>
-          <w:rFonts w:hint="eastAsia" w:ascii="Noto Serif CJK SC" w:hAnsi="Noto Serif CJK SC" w:eastAsia="Noto Serif CJK SC" w:cs="Noto Serif CJK SC"/>
-          <w:lang w:val="en-US" w:eastAsia="zh-CN"/>
-          <w:sz w:val="20"/>
-          <w:szCs w:val="20"/>
-        </w:rPr>
-        <w:t xml:space="preserve">参见</w:t>
-      </w:r>
-      <w:r>
-        <w:rPr>
-          <w:rFonts w:ascii="Noto Serif CJK SC" w:hAnsi="Noto Serif CJK SC" w:eastAsia="Noto Serif CJK SC" w:cs="Noto Serif CJK SC"/>
-          <w:lang w:val="en-US" w:eastAsia="zh-CN"/>
-          <w:sz w:val="20"/>
-          <w:szCs w:val="20"/>
-        </w:rPr>
-        <w:t xml:space="preserve"> 28 U.S.C. §§ 1331, 1332, 1367 (2024).</w:t>
+          <w:rFonts w:ascii="Noto Serif CJK SC" w:hAnsi="Noto Serif CJK SC" w:eastAsia="Noto Serif CJK SC" w:cs="Noto Serif CJK SC"/>
+          <w:lang w:val="en-US" w:eastAsia="zh-CN"/>
+          <w:sz w:val="20"/>
+          <w:szCs w:val="20"/>
+        </w:rPr>
+        <w:t xml:space="preserve">See Fed. R. Civ. P. 26(b)(1), 26(d)(1), 27(a), 34(a), 37(e), 45(a)(2);</w:t>
+      </w:r>
+      <w:r>
+        <w:rPr>
+          <w:rFonts w:ascii="Noto Serif CJK SC" w:hAnsi="Noto Serif CJK SC" w:eastAsia="Noto Serif CJK SC" w:cs="Noto Serif CJK SC"/>
+          <w:lang w:val="en-US" w:eastAsia="zh-CN"/>
+          <w:sz w:val="20"/>
+          <w:szCs w:val="20"/>
+        </w:rPr>
+        <w:t xml:space="preserve"> </w:t>
+      </w:r>
+      <w:r>
+        <w:rPr>
+          <w:rFonts w:ascii="Noto Serif CJK SC" w:hAnsi="Noto Serif CJK SC" w:eastAsia="Noto Serif CJK SC" w:cs="Noto Serif CJK SC"/>
+          <w:i/>
+          <w:iCs/>
+          <w:lang w:val="en-US" w:eastAsia="zh-CN"/>
+          <w:sz w:val="20"/>
+          <w:szCs w:val="20"/>
+        </w:rPr>
+        <w:t xml:space="preserve">Workman v. United States Postal Service</w:t>
+      </w:r>
+      <w:r>
+        <w:rPr>
+          <w:rFonts w:ascii="Noto Serif CJK SC" w:hAnsi="Noto Serif CJK SC" w:eastAsia="Noto Serif CJK SC" w:cs="Noto Serif CJK SC"/>
+          <w:lang w:val="en-US" w:eastAsia="zh-CN"/>
+          <w:sz w:val="20"/>
+          <w:szCs w:val="20"/>
+        </w:rPr>
+        <w:t xml:space="preserve">, 127 F.4th 237, 240–45 (10th Cir. </w:t>
+      </w:r>
+      <w:r>
+        <w:rPr>
+          <w:rFonts w:hint="eastAsia" w:ascii="Noto Serif CJK SC" w:hAnsi="Noto Serif CJK SC" w:eastAsia="Noto Serif CJK SC" w:cs="Noto Serif CJK SC"/>
+          <w:lang w:val="en-US" w:eastAsia="zh-CN"/>
+          <w:sz w:val="20"/>
+          <w:szCs w:val="20"/>
+        </w:rPr>
+        <w:t xml:space="preserve">2025)（维持对一项第27条申请的驳回；该申请旨在调查某项请求权是否存在，而非保存已知证言）.</w:t>
       </w:r>
     </w:p>
   </w:footnote>
@@ -14263,12 +14714,12 @@
       </w:r>
       <w:r>
         <w:rPr>
-          <w:rFonts w:hint="eastAsia" w:ascii="Noto Serif CJK SC" w:hAnsi="Noto Serif CJK SC" w:eastAsia="Noto Serif CJK SC" w:cs="Noto Serif CJK SC"/>
-          <w:lang w:val="en-US" w:eastAsia="zh-CN"/>
-          <w:sz w:val="20"/>
-          <w:szCs w:val="20"/>
-        </w:rPr>
-        <w:t xml:space="preserve">参见</w:t>
+          <w:rFonts w:ascii="Noto Serif CJK SC" w:hAnsi="Noto Serif CJK SC" w:eastAsia="Noto Serif CJK SC" w:cs="Noto Serif CJK SC"/>
+          <w:lang w:val="en-US" w:eastAsia="zh-CN"/>
+          <w:sz w:val="20"/>
+          <w:szCs w:val="20"/>
+        </w:rPr>
+        <w:t xml:space="preserve">See Fair Credit Reporting Act, 15 U.S.C. § 1681g(a)(1)–(3) (2024); Fla. Stat. § 627.4137(1) (2026); Cal. Lab. Code § 1198.5(b)–(c), (n)–(o) (2026);</w:t>
       </w:r>
       <w:r>
         <w:rPr>
@@ -14288,25 +14739,60 @@
           <w:sz w:val="20"/>
           <w:szCs w:val="20"/>
         </w:rPr>
-        <w:t xml:space="preserve">TransUnion LLC v. Ramirez,</w:t>
-      </w:r>
-      <w:r>
-        <w:rPr>
-          <w:rFonts w:ascii="Noto Serif CJK SC" w:hAnsi="Noto Serif CJK SC" w:eastAsia="Noto Serif CJK SC" w:cs="Noto Serif CJK SC"/>
-          <w:lang w:val="en-US" w:eastAsia="zh-CN"/>
-          <w:sz w:val="20"/>
-          <w:szCs w:val="20"/>
-        </w:rPr>
-        <w:t xml:space="preserve"> </w:t>
-      </w:r>
-      <w:r>
-        <w:rPr>
-          <w:rFonts w:ascii="Noto Serif CJK SC" w:hAnsi="Noto Serif CJK SC" w:eastAsia="Noto Serif CJK SC" w:cs="Noto Serif CJK SC"/>
-          <w:lang w:val="en-US" w:eastAsia="zh-CN"/>
-          <w:sz w:val="20"/>
-          <w:szCs w:val="20"/>
-        </w:rPr>
-        <w:t xml:space="preserve">594 U.S. 413, 425–31, 440–42 (2021);</w:t>
+        <w:t xml:space="preserve">American Bank v. City of Menasha</w:t>
+      </w:r>
+      <w:r>
+        <w:rPr>
+          <w:rFonts w:ascii="Noto Serif CJK SC" w:hAnsi="Noto Serif CJK SC" w:eastAsia="Noto Serif CJK SC" w:cs="Noto Serif CJK SC"/>
+          <w:lang w:val="en-US" w:eastAsia="zh-CN"/>
+          <w:sz w:val="20"/>
+          <w:szCs w:val="20"/>
+        </w:rPr>
+        <w:t xml:space="preserve">, 627 F.3d 261, 265–67 (7th Cir. 2010); see also supra note </w:t>
+      </w:r>
+      <w:r>
+        <w:rPr>
+          <w:rFonts w:hint="eastAsia" w:ascii="Noto Serif CJK SC" w:hAnsi="Noto Serif CJK SC" w:eastAsia="Noto Serif CJK SC" w:cs="Noto Serif CJK SC"/>
+          <w:lang w:val="en-US" w:eastAsia="zh-CN"/>
+          <w:sz w:val="20"/>
+          <w:szCs w:val="20"/>
+        </w:rPr>
+        <w:t xml:space="preserve">13（汇集各州诉前证据开示程序）.</w:t>
+      </w:r>
+    </w:p>
+  </w:footnote>
+  <w:footnote w:id="152">
+    <w:p>
+      <w:pPr>
+        <w:pStyle w:val="FootnoteText"/>
+      </w:pPr>
+      <w:r>
+        <w:rPr>
+          <w:rFonts w:ascii="Noto Serif CJK SC" w:hAnsi="Noto Serif CJK SC" w:eastAsia="Noto Serif CJK SC" w:cs="Noto Serif CJK SC"/>
+          <w:rStyle w:val="FootnoteReference"/>
+          <w:lang w:val="en-US" w:eastAsia="zh-CN"/>
+          <w:sz w:val="20"/>
+          <w:szCs w:val="20"/>
+        </w:rPr>
+        <w:footnoteRef/>
+      </w:r>
+      <w:r>
+        <w:rPr>
+          <w:rFonts w:ascii="Noto Serif CJK SC" w:hAnsi="Noto Serif CJK SC" w:eastAsia="Noto Serif CJK SC" w:cs="Noto Serif CJK SC"/>
+          <w:lang w:val="en-US" w:eastAsia="zh-CN"/>
+          <w:sz w:val="20"/>
+          <w:szCs w:val="20"/>
+        </w:rPr>
+        <w:t xml:space="preserve"> </w:t>
+      </w:r>
+      <w:r>
+        <w:rPr>
+          <w:rFonts w:ascii="Noto Serif CJK SC" w:hAnsi="Noto Serif CJK SC" w:eastAsia="Noto Serif CJK SC" w:cs="Noto Serif CJK SC"/>
+          <w:lang w:val="en-US" w:eastAsia="zh-CN"/>
+          <w:sz w:val="20"/>
+          <w:szCs w:val="20"/>
+        </w:rPr>
+        <w:t xml:space="preserve">See</w:t>
       </w:r>
       <w:r>
         <w:rPr>
@@ -14326,60 +14812,25 @@
           <w:sz w:val="20"/>
           <w:szCs w:val="20"/>
         </w:rPr>
-        <w:t xml:space="preserve">Spokeo, Inc. v. Robins,</w:t>
-      </w:r>
-      <w:r>
-        <w:rPr>
-          <w:rFonts w:ascii="Noto Serif CJK SC" w:hAnsi="Noto Serif CJK SC" w:eastAsia="Noto Serif CJK SC" w:cs="Noto Serif CJK SC"/>
-          <w:lang w:val="en-US" w:eastAsia="zh-CN"/>
-          <w:sz w:val="20"/>
-          <w:szCs w:val="20"/>
-        </w:rPr>
-        <w:t xml:space="preserve"> </w:t>
-      </w:r>
-      <w:r>
-        <w:rPr>
-          <w:rFonts w:ascii="Noto Serif CJK SC" w:hAnsi="Noto Serif CJK SC" w:eastAsia="Noto Serif CJK SC" w:cs="Noto Serif CJK SC"/>
-          <w:lang w:val="en-US" w:eastAsia="zh-CN"/>
-          <w:sz w:val="20"/>
-          <w:szCs w:val="20"/>
-        </w:rPr>
-        <w:t xml:space="preserve">578 U.S. 330, 339–43 (2016).</w:t>
-      </w:r>
-    </w:p>
-  </w:footnote>
-  <w:footnote w:id="152">
-    <w:p>
-      <w:pPr>
-        <w:pStyle w:val="FootnoteText"/>
-      </w:pPr>
-      <w:r>
-        <w:rPr>
-          <w:rFonts w:ascii="Noto Serif CJK SC" w:hAnsi="Noto Serif CJK SC" w:eastAsia="Noto Serif CJK SC" w:cs="Noto Serif CJK SC"/>
-          <w:rStyle w:val="FootnoteReference"/>
-          <w:lang w:val="en-US" w:eastAsia="zh-CN"/>
-          <w:sz w:val="20"/>
-          <w:szCs w:val="20"/>
-        </w:rPr>
-        <w:footnoteRef/>
-      </w:r>
-      <w:r>
-        <w:rPr>
-          <w:rFonts w:ascii="Noto Serif CJK SC" w:hAnsi="Noto Serif CJK SC" w:eastAsia="Noto Serif CJK SC" w:cs="Noto Serif CJK SC"/>
-          <w:lang w:val="en-US" w:eastAsia="zh-CN"/>
-          <w:sz w:val="20"/>
-          <w:szCs w:val="20"/>
-        </w:rPr>
-        <w:t xml:space="preserve"> </w:t>
-      </w:r>
-      <w:r>
-        <w:rPr>
-          <w:rFonts w:hint="eastAsia" w:ascii="Noto Serif CJK SC" w:hAnsi="Noto Serif CJK SC" w:eastAsia="Noto Serif CJK SC" w:cs="Noto Serif CJK SC"/>
-          <w:lang w:val="en-US" w:eastAsia="zh-CN"/>
-          <w:sz w:val="20"/>
-          <w:szCs w:val="20"/>
-        </w:rPr>
-        <w:t xml:space="preserve">参见</w:t>
+        <w:t xml:space="preserve">Berk</w:t>
+      </w:r>
+      <w:r>
+        <w:rPr>
+          <w:rFonts w:ascii="Noto Serif CJK SC" w:hAnsi="Noto Serif CJK SC" w:eastAsia="Noto Serif CJK SC" w:cs="Noto Serif CJK SC"/>
+          <w:lang w:val="en-US" w:eastAsia="zh-CN"/>
+          <w:sz w:val="20"/>
+          <w:szCs w:val="20"/>
+        </w:rPr>
+        <w:t xml:space="preserve">, 607 U.S. at </w:t>
+      </w:r>
+      <w:r>
+        <w:rPr>
+          <w:rFonts w:hint="eastAsia" w:ascii="Noto Serif CJK SC" w:hAnsi="Noto Serif CJK SC" w:eastAsia="Noto Serif CJK SC" w:cs="Noto Serif CJK SC"/>
+          <w:lang w:val="en-US" w:eastAsia="zh-CN"/>
+          <w:sz w:val="20"/>
+          <w:szCs w:val="20"/>
+        </w:rPr>
+        <w:t xml:space="preserve">195–96（区分</w:t>
       </w:r>
       <w:r>
         <w:rPr>
@@ -14399,25 +14850,16 @@
           <w:sz w:val="20"/>
           <w:szCs w:val="20"/>
         </w:rPr>
-        <w:t xml:space="preserve">Havens Realty Corp. v. Coleman,</w:t>
-      </w:r>
-      <w:r>
-        <w:rPr>
-          <w:rFonts w:ascii="Noto Serif CJK SC" w:hAnsi="Noto Serif CJK SC" w:eastAsia="Noto Serif CJK SC" w:cs="Noto Serif CJK SC"/>
-          <w:lang w:val="en-US" w:eastAsia="zh-CN"/>
-          <w:sz w:val="20"/>
-          <w:szCs w:val="20"/>
-        </w:rPr>
-        <w:t xml:space="preserve"> </w:t>
-      </w:r>
-      <w:r>
-        <w:rPr>
-          <w:rFonts w:ascii="Noto Serif CJK SC" w:hAnsi="Noto Serif CJK SC" w:eastAsia="Noto Serif CJK SC" w:cs="Noto Serif CJK SC"/>
-          <w:lang w:val="en-US" w:eastAsia="zh-CN"/>
-          <w:sz w:val="20"/>
-          <w:szCs w:val="20"/>
-        </w:rPr>
-        <w:t xml:space="preserve">455 U.S. 363, 373–74 (1982);</w:t>
+        <w:t xml:space="preserve">Cohen</w:t>
+      </w:r>
+      <w:r>
+        <w:rPr>
+          <w:rFonts w:hint="eastAsia" w:ascii="Noto Serif CJK SC" w:hAnsi="Noto Serif CJK SC" w:eastAsia="Noto Serif CJK SC" w:cs="Noto Serif CJK SC"/>
+          <w:lang w:val="en-US" w:eastAsia="zh-CN"/>
+          <w:sz w:val="20"/>
+          <w:szCs w:val="20"/>
+        </w:rPr>
+        <w:t xml:space="preserve">）;</w:t>
       </w:r>
       <w:r>
         <w:rPr>
@@ -14437,25 +14879,51 @@
           <w:sz w:val="20"/>
           <w:szCs w:val="20"/>
         </w:rPr>
-        <w:t xml:space="preserve">Pub. Citizen v. U.S. Dep’t of Just.,</w:t>
-      </w:r>
-      <w:r>
-        <w:rPr>
-          <w:rFonts w:ascii="Noto Serif CJK SC" w:hAnsi="Noto Serif CJK SC" w:eastAsia="Noto Serif CJK SC" w:cs="Noto Serif CJK SC"/>
-          <w:lang w:val="en-US" w:eastAsia="zh-CN"/>
-          <w:sz w:val="20"/>
-          <w:szCs w:val="20"/>
-        </w:rPr>
-        <w:t xml:space="preserve"> </w:t>
-      </w:r>
-      <w:r>
-        <w:rPr>
-          <w:rFonts w:ascii="Noto Serif CJK SC" w:hAnsi="Noto Serif CJK SC" w:eastAsia="Noto Serif CJK SC" w:cs="Noto Serif CJK SC"/>
-          <w:lang w:val="en-US" w:eastAsia="zh-CN"/>
-          <w:sz w:val="20"/>
-          <w:szCs w:val="20"/>
-        </w:rPr>
-        <w:t xml:space="preserve">491 U.S. 440, 449–50 (1989);</w:t>
+        <w:t xml:space="preserve">Cohen v. Beneficial Industrial Loan Corp.</w:t>
+      </w:r>
+      <w:r>
+        <w:rPr>
+          <w:rFonts w:ascii="Noto Serif CJK SC" w:hAnsi="Noto Serif CJK SC" w:eastAsia="Noto Serif CJK SC" w:cs="Noto Serif CJK SC"/>
+          <w:lang w:val="en-US" w:eastAsia="zh-CN"/>
+          <w:sz w:val="20"/>
+          <w:szCs w:val="20"/>
+        </w:rPr>
+        <w:t xml:space="preserve">, 337 U.S. 541, 555–56 (1949).</w:t>
+      </w:r>
+    </w:p>
+  </w:footnote>
+  <w:footnote w:id="153">
+    <w:p>
+      <w:pPr>
+        <w:pStyle w:val="FootnoteText"/>
+      </w:pPr>
+      <w:r>
+        <w:rPr>
+          <w:rFonts w:ascii="Noto Serif CJK SC" w:hAnsi="Noto Serif CJK SC" w:eastAsia="Noto Serif CJK SC" w:cs="Noto Serif CJK SC"/>
+          <w:rStyle w:val="FootnoteReference"/>
+          <w:lang w:val="en-US" w:eastAsia="zh-CN"/>
+          <w:sz w:val="20"/>
+          <w:szCs w:val="20"/>
+        </w:rPr>
+        <w:footnoteRef/>
+      </w:r>
+      <w:r>
+        <w:rPr>
+          <w:rFonts w:ascii="Noto Serif CJK SC" w:hAnsi="Noto Serif CJK SC" w:eastAsia="Noto Serif CJK SC" w:cs="Noto Serif CJK SC"/>
+          <w:lang w:val="en-US" w:eastAsia="zh-CN"/>
+          <w:sz w:val="20"/>
+          <w:szCs w:val="20"/>
+        </w:rPr>
+        <w:t xml:space="preserve"> </w:t>
+      </w:r>
+      <w:r>
+        <w:rPr>
+          <w:rFonts w:ascii="Noto Serif CJK SC" w:hAnsi="Noto Serif CJK SC" w:eastAsia="Noto Serif CJK SC" w:cs="Noto Serif CJK SC"/>
+          <w:lang w:val="en-US" w:eastAsia="zh-CN"/>
+          <w:sz w:val="20"/>
+          <w:szCs w:val="20"/>
+        </w:rPr>
+        <w:t xml:space="preserve">Compare</w:t>
       </w:r>
       <w:r>
         <w:rPr>
@@ -14475,60 +14943,34 @@
           <w:sz w:val="20"/>
           <w:szCs w:val="20"/>
         </w:rPr>
-        <w:t xml:space="preserve">Fed. Election Comm’n v. Akins,</w:t>
-      </w:r>
-      <w:r>
-        <w:rPr>
-          <w:rFonts w:ascii="Noto Serif CJK SC" w:hAnsi="Noto Serif CJK SC" w:eastAsia="Noto Serif CJK SC" w:cs="Noto Serif CJK SC"/>
-          <w:lang w:val="en-US" w:eastAsia="zh-CN"/>
-          <w:sz w:val="20"/>
-          <w:szCs w:val="20"/>
-        </w:rPr>
-        <w:t xml:space="preserve"> </w:t>
-      </w:r>
-      <w:r>
-        <w:rPr>
-          <w:rFonts w:ascii="Noto Serif CJK SC" w:hAnsi="Noto Serif CJK SC" w:eastAsia="Noto Serif CJK SC" w:cs="Noto Serif CJK SC"/>
-          <w:lang w:val="en-US" w:eastAsia="zh-CN"/>
-          <w:sz w:val="20"/>
-          <w:szCs w:val="20"/>
-        </w:rPr>
-        <w:t xml:space="preserve">524 U.S. 11, 21–25 (1998).</w:t>
-      </w:r>
-    </w:p>
-  </w:footnote>
-  <w:footnote w:id="153">
-    <w:p>
-      <w:pPr>
-        <w:pStyle w:val="FootnoteText"/>
-      </w:pPr>
-      <w:r>
-        <w:rPr>
-          <w:rFonts w:ascii="Noto Serif CJK SC" w:hAnsi="Noto Serif CJK SC" w:eastAsia="Noto Serif CJK SC" w:cs="Noto Serif CJK SC"/>
-          <w:rStyle w:val="FootnoteReference"/>
-          <w:lang w:val="en-US" w:eastAsia="zh-CN"/>
-          <w:sz w:val="20"/>
-          <w:szCs w:val="20"/>
-        </w:rPr>
-        <w:footnoteRef/>
-      </w:r>
-      <w:r>
-        <w:rPr>
-          <w:rFonts w:ascii="Noto Serif CJK SC" w:hAnsi="Noto Serif CJK SC" w:eastAsia="Noto Serif CJK SC" w:cs="Noto Serif CJK SC"/>
-          <w:lang w:val="en-US" w:eastAsia="zh-CN"/>
-          <w:sz w:val="20"/>
-          <w:szCs w:val="20"/>
-        </w:rPr>
-        <w:t xml:space="preserve"> </w:t>
-      </w:r>
-      <w:r>
-        <w:rPr>
-          <w:rFonts w:hint="eastAsia" w:ascii="Noto Serif CJK SC" w:hAnsi="Noto Serif CJK SC" w:eastAsia="Noto Serif CJK SC" w:cs="Noto Serif CJK SC"/>
-          <w:lang w:val="en-US" w:eastAsia="zh-CN"/>
-          <w:sz w:val="20"/>
-          <w:szCs w:val="20"/>
-        </w:rPr>
-        <w:t xml:space="preserve">参见</w:t>
+        <w:t xml:space="preserve">In re Citric Acid Litigation</w:t>
+      </w:r>
+      <w:r>
+        <w:rPr>
+          <w:rFonts w:ascii="Noto Serif CJK SC" w:hAnsi="Noto Serif CJK SC" w:eastAsia="Noto Serif CJK SC" w:cs="Noto Serif CJK SC"/>
+          <w:lang w:val="en-US" w:eastAsia="zh-CN"/>
+          <w:sz w:val="20"/>
+          <w:szCs w:val="20"/>
+        </w:rPr>
+        <w:t xml:space="preserve">, 191 F.3d 1090, 1107–08 (9th Cir. </w:t>
+      </w:r>
+      <w:r>
+        <w:rPr>
+          <w:rFonts w:hint="eastAsia" w:ascii="Noto Serif CJK SC" w:hAnsi="Noto Serif CJK SC" w:eastAsia="Noto Serif CJK SC" w:cs="Noto Serif CJK SC"/>
+          <w:lang w:val="en-US" w:eastAsia="zh-CN"/>
+          <w:sz w:val="20"/>
+          <w:szCs w:val="20"/>
+        </w:rPr>
+        <w:t xml:space="preserve">1999)（采用按需取得资料之法律权利检验）,</w:t>
+      </w:r>
+      <w:r>
+        <w:rPr>
+          <w:rFonts w:ascii="Noto Serif CJK SC" w:hAnsi="Noto Serif CJK SC" w:eastAsia="Noto Serif CJK SC" w:cs="Noto Serif CJK SC"/>
+          <w:lang w:val="en-US" w:eastAsia="zh-CN"/>
+          <w:sz w:val="20"/>
+          <w:szCs w:val="20"/>
+        </w:rPr>
+        <w:t xml:space="preserve"> with</w:t>
       </w:r>
       <w:r>
         <w:rPr>
@@ -14548,25 +14990,43 @@
           <w:sz w:val="20"/>
           <w:szCs w:val="20"/>
         </w:rPr>
-        <w:t xml:space="preserve">ASARCO Inc. v. Kadish,</w:t>
-      </w:r>
-      <w:r>
-        <w:rPr>
-          <w:rFonts w:ascii="Noto Serif CJK SC" w:hAnsi="Noto Serif CJK SC" w:eastAsia="Noto Serif CJK SC" w:cs="Noto Serif CJK SC"/>
-          <w:lang w:val="en-US" w:eastAsia="zh-CN"/>
-          <w:sz w:val="20"/>
-          <w:szCs w:val="20"/>
-        </w:rPr>
-        <w:t xml:space="preserve"> </w:t>
-      </w:r>
-      <w:r>
-        <w:rPr>
-          <w:rFonts w:ascii="Noto Serif CJK SC" w:hAnsi="Noto Serif CJK SC" w:eastAsia="Noto Serif CJK SC" w:cs="Noto Serif CJK SC"/>
-          <w:lang w:val="en-US" w:eastAsia="zh-CN"/>
-          <w:sz w:val="20"/>
-          <w:szCs w:val="20"/>
-        </w:rPr>
-        <w:t xml:space="preserve">490 U.S. 605, 617–18 (1989).</w:t>
+        <w:t xml:space="preserve">Sergeeva v. Tripleton International Ltd.</w:t>
+      </w:r>
+      <w:r>
+        <w:rPr>
+          <w:rFonts w:ascii="Noto Serif CJK SC" w:hAnsi="Noto Serif CJK SC" w:eastAsia="Noto Serif CJK SC" w:cs="Noto Serif CJK SC"/>
+          <w:lang w:val="en-US" w:eastAsia="zh-CN"/>
+          <w:sz w:val="20"/>
+          <w:szCs w:val="20"/>
+        </w:rPr>
+        <w:t xml:space="preserve">, 834 F.3d 1194, 1200–02 (11th Cir. </w:t>
+      </w:r>
+      <w:r>
+        <w:rPr>
+          <w:rFonts w:hint="eastAsia" w:ascii="Noto Serif CJK SC" w:hAnsi="Noto Serif CJK SC" w:eastAsia="Noto Serif CJK SC" w:cs="Noto Serif CJK SC"/>
+          <w:lang w:val="en-US" w:eastAsia="zh-CN"/>
+          <w:sz w:val="20"/>
+          <w:szCs w:val="20"/>
+        </w:rPr>
+        <w:t xml:space="preserve">2016)（在依据</w:t>
+      </w:r>
+      <w:r>
+        <w:rPr>
+          <w:rFonts w:ascii="Noto Serif CJK SC" w:hAnsi="Noto Serif CJK SC" w:eastAsia="Noto Serif CJK SC" w:cs="Noto Serif CJK SC"/>
+          <w:lang w:val="en-US" w:eastAsia="zh-CN"/>
+          <w:sz w:val="20"/>
+          <w:szCs w:val="20"/>
+        </w:rPr>
+        <w:t xml:space="preserve"> 28 U.S.C. § 1782 </w:t>
+      </w:r>
+      <w:r>
+        <w:rPr>
+          <w:rFonts w:hint="eastAsia" w:ascii="Noto Serif CJK SC" w:hAnsi="Noto Serif CJK SC" w:eastAsia="Noto Serif CJK SC" w:cs="Noto Serif CJK SC"/>
+          <w:lang w:val="en-US" w:eastAsia="zh-CN"/>
+          <w:sz w:val="20"/>
+          <w:szCs w:val="20"/>
+        </w:rPr>
+        <w:t xml:space="preserve">进行的程序中，维持一项控制认定；该认定以关联实体之间通常的交易惯例及其取得回应性信息的能力为依据）.</w:t>
       </w:r>
     </w:p>
   </w:footnote>
@@ -14596,12 +15056,12 @@
       </w:r>
       <w:r>
         <w:rPr>
-          <w:rFonts w:hint="eastAsia" w:ascii="Noto Serif CJK SC" w:hAnsi="Noto Serif CJK SC" w:eastAsia="Noto Serif CJK SC" w:cs="Noto Serif CJK SC"/>
-          <w:lang w:val="en-US" w:eastAsia="zh-CN"/>
-          <w:sz w:val="20"/>
-          <w:szCs w:val="20"/>
-        </w:rPr>
-        <w:t xml:space="preserve">参见</w:t>
+          <w:rFonts w:ascii="Noto Serif CJK SC" w:hAnsi="Noto Serif CJK SC" w:eastAsia="Noto Serif CJK SC" w:cs="Noto Serif CJK SC"/>
+          <w:lang w:val="en-US" w:eastAsia="zh-CN"/>
+          <w:sz w:val="20"/>
+          <w:szCs w:val="20"/>
+        </w:rPr>
+        <w:t xml:space="preserve">See 28 U.S.C. §§ 1331, 1332, 1367 (2024);</w:t>
       </w:r>
       <w:r>
         <w:rPr>
@@ -14621,25 +15081,16 @@
           <w:sz w:val="20"/>
           <w:szCs w:val="20"/>
         </w:rPr>
-        <w:t xml:space="preserve">Hanna v. Plumer,</w:t>
-      </w:r>
-      <w:r>
-        <w:rPr>
-          <w:rFonts w:ascii="Noto Serif CJK SC" w:hAnsi="Noto Serif CJK SC" w:eastAsia="Noto Serif CJK SC" w:cs="Noto Serif CJK SC"/>
-          <w:lang w:val="en-US" w:eastAsia="zh-CN"/>
-          <w:sz w:val="20"/>
-          <w:szCs w:val="20"/>
-        </w:rPr>
-        <w:t xml:space="preserve"> </w:t>
-      </w:r>
-      <w:r>
-        <w:rPr>
-          <w:rFonts w:ascii="Noto Serif CJK SC" w:hAnsi="Noto Serif CJK SC" w:eastAsia="Noto Serif CJK SC" w:cs="Noto Serif CJK SC"/>
-          <w:lang w:val="en-US" w:eastAsia="zh-CN"/>
-          <w:sz w:val="20"/>
-          <w:szCs w:val="20"/>
-        </w:rPr>
-        <w:t xml:space="preserve">380 U.S. 460, 464–65, 468, 471–74 (1965);</w:t>
+        <w:t xml:space="preserve">TransUnion LLC v. Ramirez</w:t>
+      </w:r>
+      <w:r>
+        <w:rPr>
+          <w:rFonts w:ascii="Noto Serif CJK SC" w:hAnsi="Noto Serif CJK SC" w:eastAsia="Noto Serif CJK SC" w:cs="Noto Serif CJK SC"/>
+          <w:lang w:val="en-US" w:eastAsia="zh-CN"/>
+          <w:sz w:val="20"/>
+          <w:szCs w:val="20"/>
+        </w:rPr>
+        <w:t xml:space="preserve">, 594 U.S. 413, 425–31, 440–42 (2021);</w:t>
       </w:r>
       <w:r>
         <w:rPr>
@@ -14659,25 +15110,16 @@
           <w:sz w:val="20"/>
           <w:szCs w:val="20"/>
         </w:rPr>
-        <w:t xml:space="preserve">Burlington N. R.R. Co. v. Woods,</w:t>
-      </w:r>
-      <w:r>
-        <w:rPr>
-          <w:rFonts w:ascii="Noto Serif CJK SC" w:hAnsi="Noto Serif CJK SC" w:eastAsia="Noto Serif CJK SC" w:cs="Noto Serif CJK SC"/>
-          <w:lang w:val="en-US" w:eastAsia="zh-CN"/>
-          <w:sz w:val="20"/>
-          <w:szCs w:val="20"/>
-        </w:rPr>
-        <w:t xml:space="preserve"> </w:t>
-      </w:r>
-      <w:r>
-        <w:rPr>
-          <w:rFonts w:ascii="Noto Serif CJK SC" w:hAnsi="Noto Serif CJK SC" w:eastAsia="Noto Serif CJK SC" w:cs="Noto Serif CJK SC"/>
-          <w:lang w:val="en-US" w:eastAsia="zh-CN"/>
-          <w:sz w:val="20"/>
-          <w:szCs w:val="20"/>
-        </w:rPr>
-        <w:t xml:space="preserve">480 U.S. 1, 4–8 (1987);</w:t>
+        <w:t xml:space="preserve">Spokeo, Inc. v. Robins</w:t>
+      </w:r>
+      <w:r>
+        <w:rPr>
+          <w:rFonts w:ascii="Noto Serif CJK SC" w:hAnsi="Noto Serif CJK SC" w:eastAsia="Noto Serif CJK SC" w:cs="Noto Serif CJK SC"/>
+          <w:lang w:val="en-US" w:eastAsia="zh-CN"/>
+          <w:sz w:val="20"/>
+          <w:szCs w:val="20"/>
+        </w:rPr>
+        <w:t xml:space="preserve">, 578 U.S. 330, 339–43 (2016);</w:t>
       </w:r>
       <w:r>
         <w:rPr>
@@ -14697,25 +15139,103 @@
           <w:sz w:val="20"/>
           <w:szCs w:val="20"/>
         </w:rPr>
-        <w:t xml:space="preserve">Walker v. Armco Steel Corp.,</w:t>
-      </w:r>
-      <w:r>
-        <w:rPr>
-          <w:rFonts w:ascii="Noto Serif CJK SC" w:hAnsi="Noto Serif CJK SC" w:eastAsia="Noto Serif CJK SC" w:cs="Noto Serif CJK SC"/>
-          <w:lang w:val="en-US" w:eastAsia="zh-CN"/>
-          <w:sz w:val="20"/>
-          <w:szCs w:val="20"/>
-        </w:rPr>
-        <w:t xml:space="preserve"> </w:t>
-      </w:r>
-      <w:r>
-        <w:rPr>
-          <w:rFonts w:ascii="Noto Serif CJK SC" w:hAnsi="Noto Serif CJK SC" w:eastAsia="Noto Serif CJK SC" w:cs="Noto Serif CJK SC"/>
-          <w:lang w:val="en-US" w:eastAsia="zh-CN"/>
-          <w:sz w:val="20"/>
-          <w:szCs w:val="20"/>
-        </w:rPr>
-        <w:t xml:space="preserve">446 U.S. 740, 749–52 (1980); Rules Enabling Act, 28 U.S.C. § 2072(a)–(b) (2024).</w:t>
+        <w:t xml:space="preserve">Havens Realty Corp. v. Coleman</w:t>
+      </w:r>
+      <w:r>
+        <w:rPr>
+          <w:rFonts w:ascii="Noto Serif CJK SC" w:hAnsi="Noto Serif CJK SC" w:eastAsia="Noto Serif CJK SC" w:cs="Noto Serif CJK SC"/>
+          <w:lang w:val="en-US" w:eastAsia="zh-CN"/>
+          <w:sz w:val="20"/>
+          <w:szCs w:val="20"/>
+        </w:rPr>
+        <w:t xml:space="preserve">, 455 U.S. 363, 373–74 (1982);</w:t>
+      </w:r>
+      <w:r>
+        <w:rPr>
+          <w:rFonts w:ascii="Noto Serif CJK SC" w:hAnsi="Noto Serif CJK SC" w:eastAsia="Noto Serif CJK SC" w:cs="Noto Serif CJK SC"/>
+          <w:lang w:val="en-US" w:eastAsia="zh-CN"/>
+          <w:sz w:val="20"/>
+          <w:szCs w:val="20"/>
+        </w:rPr>
+        <w:t xml:space="preserve"> </w:t>
+      </w:r>
+      <w:r>
+        <w:rPr>
+          <w:rFonts w:ascii="Noto Serif CJK SC" w:hAnsi="Noto Serif CJK SC" w:eastAsia="Noto Serif CJK SC" w:cs="Noto Serif CJK SC"/>
+          <w:i/>
+          <w:iCs/>
+          <w:lang w:val="en-US" w:eastAsia="zh-CN"/>
+          <w:sz w:val="20"/>
+          <w:szCs w:val="20"/>
+        </w:rPr>
+        <w:t xml:space="preserve">Public Citizen v. United States Department of Justice</w:t>
+      </w:r>
+      <w:r>
+        <w:rPr>
+          <w:rFonts w:ascii="Noto Serif CJK SC" w:hAnsi="Noto Serif CJK SC" w:eastAsia="Noto Serif CJK SC" w:cs="Noto Serif CJK SC"/>
+          <w:lang w:val="en-US" w:eastAsia="zh-CN"/>
+          <w:sz w:val="20"/>
+          <w:szCs w:val="20"/>
+        </w:rPr>
+        <w:t xml:space="preserve">, 491 U.S. 440, 449–50 (1989);</w:t>
+      </w:r>
+      <w:r>
+        <w:rPr>
+          <w:rFonts w:ascii="Noto Serif CJK SC" w:hAnsi="Noto Serif CJK SC" w:eastAsia="Noto Serif CJK SC" w:cs="Noto Serif CJK SC"/>
+          <w:lang w:val="en-US" w:eastAsia="zh-CN"/>
+          <w:sz w:val="20"/>
+          <w:szCs w:val="20"/>
+        </w:rPr>
+        <w:t xml:space="preserve"> </w:t>
+      </w:r>
+      <w:r>
+        <w:rPr>
+          <w:rFonts w:ascii="Noto Serif CJK SC" w:hAnsi="Noto Serif CJK SC" w:eastAsia="Noto Serif CJK SC" w:cs="Noto Serif CJK SC"/>
+          <w:i/>
+          <w:iCs/>
+          <w:lang w:val="en-US" w:eastAsia="zh-CN"/>
+          <w:sz w:val="20"/>
+          <w:szCs w:val="20"/>
+        </w:rPr>
+        <w:t xml:space="preserve">Federal Election Commission v. Akins</w:t>
+      </w:r>
+      <w:r>
+        <w:rPr>
+          <w:rFonts w:ascii="Noto Serif CJK SC" w:hAnsi="Noto Serif CJK SC" w:eastAsia="Noto Serif CJK SC" w:cs="Noto Serif CJK SC"/>
+          <w:lang w:val="en-US" w:eastAsia="zh-CN"/>
+          <w:sz w:val="20"/>
+          <w:szCs w:val="20"/>
+        </w:rPr>
+        <w:t xml:space="preserve">, 524 U.S. 11, 21–25 (1998);</w:t>
+      </w:r>
+      <w:r>
+        <w:rPr>
+          <w:rFonts w:ascii="Noto Serif CJK SC" w:hAnsi="Noto Serif CJK SC" w:eastAsia="Noto Serif CJK SC" w:cs="Noto Serif CJK SC"/>
+          <w:lang w:val="en-US" w:eastAsia="zh-CN"/>
+          <w:sz w:val="20"/>
+          <w:szCs w:val="20"/>
+        </w:rPr>
+        <w:t xml:space="preserve"> </w:t>
+      </w:r>
+      <w:r>
+        <w:rPr>
+          <w:rFonts w:ascii="Noto Serif CJK SC" w:hAnsi="Noto Serif CJK SC" w:eastAsia="Noto Serif CJK SC" w:cs="Noto Serif CJK SC"/>
+          <w:i/>
+          <w:iCs/>
+          <w:lang w:val="en-US" w:eastAsia="zh-CN"/>
+          <w:sz w:val="20"/>
+          <w:szCs w:val="20"/>
+        </w:rPr>
+        <w:t xml:space="preserve">ASARCO Inc. v. Kadish</w:t>
+      </w:r>
+      <w:r>
+        <w:rPr>
+          <w:rFonts w:ascii="Noto Serif CJK SC" w:hAnsi="Noto Serif CJK SC" w:eastAsia="Noto Serif CJK SC" w:cs="Noto Serif CJK SC"/>
+          <w:lang w:val="en-US" w:eastAsia="zh-CN"/>
+          <w:sz w:val="20"/>
+          <w:szCs w:val="20"/>
+        </w:rPr>
+        <w:t xml:space="preserve">, 490 U.S. 605, 617–18 (1989).</w:t>
       </w:r>
     </w:p>
   </w:footnote>
@@ -14745,21 +15265,70 @@
       </w:r>
       <w:r>
         <w:rPr>
-          <w:rFonts w:hint="eastAsia" w:ascii="Noto Serif CJK SC" w:hAnsi="Noto Serif CJK SC" w:eastAsia="Noto Serif CJK SC" w:cs="Noto Serif CJK SC"/>
-          <w:lang w:val="en-US" w:eastAsia="zh-CN"/>
-          <w:sz w:val="20"/>
-          <w:szCs w:val="20"/>
-        </w:rPr>
-        <w:t xml:space="preserve">参见</w:t>
-      </w:r>
-      <w:r>
-        <w:rPr>
-          <w:rFonts w:ascii="Noto Serif CJK SC" w:hAnsi="Noto Serif CJK SC" w:eastAsia="Noto Serif CJK SC" w:cs="Noto Serif CJK SC"/>
-          <w:lang w:val="en-US" w:eastAsia="zh-CN"/>
-          <w:sz w:val="20"/>
-          <w:szCs w:val="20"/>
-        </w:rPr>
-        <w:t xml:space="preserve"> Fed. R. Civ. P. 37(e).</w:t>
+          <w:rFonts w:ascii="Noto Serif CJK SC" w:hAnsi="Noto Serif CJK SC" w:eastAsia="Noto Serif CJK SC" w:cs="Noto Serif CJK SC"/>
+          <w:lang w:val="en-US" w:eastAsia="zh-CN"/>
+          <w:sz w:val="20"/>
+          <w:szCs w:val="20"/>
+        </w:rPr>
+        <w:t xml:space="preserve">See</w:t>
+      </w:r>
+      <w:r>
+        <w:rPr>
+          <w:rFonts w:ascii="Noto Serif CJK SC" w:hAnsi="Noto Serif CJK SC" w:eastAsia="Noto Serif CJK SC" w:cs="Noto Serif CJK SC"/>
+          <w:lang w:val="en-US" w:eastAsia="zh-CN"/>
+          <w:sz w:val="20"/>
+          <w:szCs w:val="20"/>
+        </w:rPr>
+        <w:t xml:space="preserve"> </w:t>
+      </w:r>
+      <w:r>
+        <w:rPr>
+          <w:rFonts w:ascii="Noto Serif CJK SC" w:hAnsi="Noto Serif CJK SC" w:eastAsia="Noto Serif CJK SC" w:cs="Noto Serif CJK SC"/>
+          <w:i/>
+          <w:iCs/>
+          <w:lang w:val="en-US" w:eastAsia="zh-CN"/>
+          <w:sz w:val="20"/>
+          <w:szCs w:val="20"/>
+        </w:rPr>
+        <w:t xml:space="preserve">Walker v. Armco Steel Corp.</w:t>
+      </w:r>
+      <w:r>
+        <w:rPr>
+          <w:rFonts w:ascii="Noto Serif CJK SC" w:hAnsi="Noto Serif CJK SC" w:eastAsia="Noto Serif CJK SC" w:cs="Noto Serif CJK SC"/>
+          <w:lang w:val="en-US" w:eastAsia="zh-CN"/>
+          <w:sz w:val="20"/>
+          <w:szCs w:val="20"/>
+        </w:rPr>
+        <w:t xml:space="preserve">, 446 U.S. 740, 750–52 (1980);</w:t>
+      </w:r>
+      <w:r>
+        <w:rPr>
+          <w:rFonts w:ascii="Noto Serif CJK SC" w:hAnsi="Noto Serif CJK SC" w:eastAsia="Noto Serif CJK SC" w:cs="Noto Serif CJK SC"/>
+          <w:lang w:val="en-US" w:eastAsia="zh-CN"/>
+          <w:sz w:val="20"/>
+          <w:szCs w:val="20"/>
+        </w:rPr>
+        <w:t xml:space="preserve"> </w:t>
+      </w:r>
+      <w:r>
+        <w:rPr>
+          <w:rFonts w:ascii="Noto Serif CJK SC" w:hAnsi="Noto Serif CJK SC" w:eastAsia="Noto Serif CJK SC" w:cs="Noto Serif CJK SC"/>
+          <w:i/>
+          <w:iCs/>
+          <w:lang w:val="en-US" w:eastAsia="zh-CN"/>
+          <w:sz w:val="20"/>
+          <w:szCs w:val="20"/>
+        </w:rPr>
+        <w:t xml:space="preserve">Berk</w:t>
+      </w:r>
+      <w:r>
+        <w:rPr>
+          <w:rFonts w:ascii="Noto Serif CJK SC" w:hAnsi="Noto Serif CJK SC" w:eastAsia="Noto Serif CJK SC" w:cs="Noto Serif CJK SC"/>
+          <w:lang w:val="en-US" w:eastAsia="zh-CN"/>
+          <w:sz w:val="20"/>
+          <w:szCs w:val="20"/>
+        </w:rPr>
+        <w:t xml:space="preserve">, 607 U.S. at 205 (Jackson, J., concurring in the judgment); Fed. R. Civ. P. 15(c), 37(e).</w:t>
       </w:r>
     </w:p>
   </w:footnote>

</xml_diff>